<commit_message>
feat(word): change registration sheet closes the set
The registration sheet is always the set's last sheet: ContentsPlanner
adds its row to the contents and counts it in the total (<SCount>).
The sheet itself is written with the final report from
Registration/template.docx once Ilya has made it (<DocumentNumber>,
<Name>, <SheetNumber>, <SCount>); until then the report summary says
the template is missing.

Co-Authored-By: Claude Opus 5.5 <noreply@anthropic.com>
</commit_message>
<xml_diff>
--- a/src/OperationMaps.Infrastructure/Word/Resources/Content/template.docx
+++ b/src/OperationMaps.Infrastructure/Word/Resources/Content/template.docx
@@ -490,7 +490,283 @@
       <mc:AlternateContent>
         <mc:Choice Requires="wps">
           <w:drawing>
-            <wp:anchor distT="0" distB="0" distL="114300" distR="114300" simplePos="0" relativeHeight="251680256" behindDoc="0" locked="0" layoutInCell="0" allowOverlap="1" wp14:anchorId="77AB8419" wp14:editId="09F7A50D">
+            <wp:anchor distT="0" distB="0" distL="114300" distR="114300" simplePos="0" relativeHeight="251653632" behindDoc="0" locked="0" layoutInCell="0" allowOverlap="1" wp14:anchorId="36B76F31" wp14:editId="1ED32D14">
+              <wp:simplePos x="0" y="0"/>
+              <wp:positionH relativeFrom="margin">
+                <wp:posOffset>13402310</wp:posOffset>
+              </wp:positionH>
+              <wp:positionV relativeFrom="paragraph">
+                <wp:posOffset>-281940</wp:posOffset>
+              </wp:positionV>
+              <wp:extent cx="793750" cy="171450"/>
+              <wp:effectExtent l="0" t="0" r="6350" b="0"/>
+              <wp:wrapNone/>
+              <wp:docPr id="162" name="Text Box 513"/>
+              <wp:cNvGraphicFramePr>
+                <a:graphicFrameLocks xmlns:a="http://schemas.openxmlformats.org/drawingml/2006/main"/>
+              </wp:cNvGraphicFramePr>
+              <a:graphic xmlns:a="http://schemas.openxmlformats.org/drawingml/2006/main">
+                <a:graphicData uri="http://schemas.microsoft.com/office/word/2010/wordprocessingShape">
+                  <wps:wsp>
+                    <wps:cNvSpPr txBox="1">
+                      <a:spLocks noChangeArrowheads="1"/>
+                    </wps:cNvSpPr>
+                    <wps:spPr bwMode="auto">
+                      <a:xfrm>
+                        <a:off x="0" y="0"/>
+                        <a:ext cx="793750" cy="171450"/>
+                      </a:xfrm>
+                      <a:prstGeom prst="rect">
+                        <a:avLst/>
+                      </a:prstGeom>
+                      <a:noFill/>
+                      <a:ln>
+                        <a:noFill/>
+                      </a:ln>
+                      <a:extLst>
+                        <a:ext uri="{909E8E84-426E-40DD-AFC4-6F175D3DCCD1}">
+                          <a14:hiddenFill xmlns:a14="http://schemas.microsoft.com/office/drawing/2010/main">
+                            <a:solidFill>
+                              <a:srgbClr val="FFFFFF"/>
+                            </a:solidFill>
+                          </a14:hiddenFill>
+                        </a:ext>
+                        <a:ext uri="{91240B29-F687-4F45-9708-019B960494DF}">
+                          <a14:hiddenLine xmlns:a14="http://schemas.microsoft.com/office/drawing/2010/main" w="15875">
+                            <a:solidFill>
+                              <a:srgbClr val="000000"/>
+                            </a:solidFill>
+                            <a:miter lim="800000"/>
+                            <a:headEnd/>
+                            <a:tailEnd/>
+                          </a14:hiddenLine>
+                        </a:ext>
+                      </a:extLst>
+                    </wps:spPr>
+                    <wps:txbx>
+                      <w:txbxContent>
+                        <w:p>
+                          <w:pPr>
+                            <w:jc w:val="center"/>
+                            <w:rPr>
+                              <w:lang w:val="en-US"/>
+                            </w:rPr>
+                          </w:pPr>
+                          <w:r>
+                            <w:rPr>
+                              <w:lang w:val="en-US"/>
+                            </w:rPr>
+                            <w:t>&lt;</w:t>
+                          </w:r>
+                          <w:proofErr w:type="spellStart"/>
+                          <w:r>
+                            <w:rPr>
+                              <w:lang w:val="en-US"/>
+                            </w:rPr>
+                            <w:t>SCount</w:t>
+                          </w:r>
+                          <w:proofErr w:type="spellEnd"/>
+                          <w:r>
+                            <w:rPr>
+                              <w:lang w:val="en-US"/>
+                            </w:rPr>
+                            <w:t>&gt;</w:t>
+                          </w:r>
+                          <w:r>
+                            <w:rPr>
+                              <w:rStyle w:val="PageNumber"/>
+                            </w:rPr>
+                            <w:fldChar w:fldCharType="begin"/>
+                          </w:r>
+                          <w:r>
+                            <w:rPr>
+                              <w:rStyle w:val="PageNumber"/>
+                            </w:rPr>
+                            <w:fldChar w:fldCharType="begin"/>
+                          </w:r>
+                          <w:r>
+                            <w:rPr>
+                              <w:rStyle w:val="PageNumber"/>
+                            </w:rPr>
+                            <w:instrText xml:space="preserve"> PAGE </w:instrText>
+                          </w:r>
+                          <w:r>
+                            <w:rPr>
+                              <w:rStyle w:val="PageNumber"/>
+                            </w:rPr>
+                            <w:fldChar w:fldCharType="separate"/>
+                          </w:r>
+                          <w:r>
+                            <w:rPr>
+                              <w:rStyle w:val="PageNumber"/>
+                              <w:noProof/>
+                            </w:rPr>
+                            <w:instrText>1</w:instrText>
+                          </w:r>
+                          <w:r>
+                            <w:rPr>
+                              <w:rStyle w:val="PageNumber"/>
+                            </w:rPr>
+                            <w:fldChar w:fldCharType="end"/>
+                          </w:r>
+                          <w:r>
+                            <w:rPr>
+                              <w:rStyle w:val="PageNumber"/>
+                            </w:rPr>
+                            <w:instrText xml:space="preserve"> PAGE </w:instrText>
+                          </w:r>
+                          <w:r>
+                            <w:rPr>
+                              <w:rStyle w:val="PageNumber"/>
+                            </w:rPr>
+                            <w:fldChar w:fldCharType="separate"/>
+                          </w:r>
+                          <w:r>
+                            <w:rPr>
+                              <w:rStyle w:val="PageNumber"/>
+                              <w:noProof/>
+                            </w:rPr>
+                            <w:t>6</w:t>
+                          </w:r>
+                          <w:r>
+                            <w:rPr>
+                              <w:rStyle w:val="PageNumber"/>
+                            </w:rPr>
+                            <w:fldChar w:fldCharType="end"/>
+                          </w:r>
+                        </w:p>
+                      </w:txbxContent>
+                    </wps:txbx>
+                    <wps:bodyPr rot="0" vert="horz" wrap="square" lIns="0" tIns="0" rIns="0" bIns="0" anchor="t" anchorCtr="0" upright="1">
+                      <a:noAutofit/>
+                    </wps:bodyPr>
+                  </wps:wsp>
+                </a:graphicData>
+              </a:graphic>
+              <wp14:sizeRelH relativeFrom="page">
+                <wp14:pctWidth>0</wp14:pctWidth>
+              </wp14:sizeRelH>
+              <wp14:sizeRelV relativeFrom="page">
+                <wp14:pctHeight>0</wp14:pctHeight>
+              </wp14:sizeRelV>
+            </wp:anchor>
+          </w:drawing>
+        </mc:Choice>
+        <mc:Fallback>
+          <w:pict>
+            <v:shapetype w14:anchorId="36B76F31" id="_x0000_t202" coordsize="21600,21600" o:spt="202" path="m,l,21600r21600,l21600,xe">
+              <v:stroke joinstyle="miter"/>
+              <v:path gradientshapeok="t" o:connecttype="rect"/>
+            </v:shapetype>
+            <v:shape id="Text Box 513" o:spid="_x0000_s1089" type="#_x0000_t202" style="position:absolute;margin-left:1055.3pt;margin-top:-22.2pt;width:62.5pt;height:13.5pt;z-index:251653632;visibility:visible;mso-wrap-style:square;mso-width-percent:0;mso-height-percent:0;mso-wrap-distance-left:9pt;mso-wrap-distance-top:0;mso-wrap-distance-right:9pt;mso-wrap-distance-bottom:0;mso-position-horizontal:absolute;mso-position-horizontal-relative:margin;mso-position-vertical:absolute;mso-position-vertical-relative:text;mso-width-percent:0;mso-height-percent:0;mso-width-relative:page;mso-height-relative:page;v-text-anchor:top" o:gfxdata="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" o:allowincell="f" filled="f" stroked="f" strokeweight="1.25pt">
+              <v:textbox inset="0,0,0,0">
+                <w:txbxContent>
+                  <w:p>
+                    <w:pPr>
+                      <w:jc w:val="center"/>
+                      <w:rPr>
+                        <w:lang w:val="en-US"/>
+                      </w:rPr>
+                    </w:pPr>
+                    <w:r>
+                      <w:rPr>
+                        <w:lang w:val="en-US"/>
+                      </w:rPr>
+                      <w:t>&lt;</w:t>
+                    </w:r>
+                    <w:proofErr w:type="spellStart"/>
+                    <w:r>
+                      <w:rPr>
+                        <w:lang w:val="en-US"/>
+                      </w:rPr>
+                      <w:t>SCount</w:t>
+                    </w:r>
+                    <w:proofErr w:type="spellEnd"/>
+                    <w:r>
+                      <w:rPr>
+                        <w:lang w:val="en-US"/>
+                      </w:rPr>
+                      <w:t>&gt;</w:t>
+                    </w:r>
+                    <w:r>
+                      <w:rPr>
+                        <w:rStyle w:val="PageNumber"/>
+                      </w:rPr>
+                      <w:fldChar w:fldCharType="begin"/>
+                    </w:r>
+                    <w:r>
+                      <w:rPr>
+                        <w:rStyle w:val="PageNumber"/>
+                      </w:rPr>
+                      <w:fldChar w:fldCharType="begin"/>
+                    </w:r>
+                    <w:r>
+                      <w:rPr>
+                        <w:rStyle w:val="PageNumber"/>
+                      </w:rPr>
+                      <w:instrText xml:space="preserve"> PAGE </w:instrText>
+                    </w:r>
+                    <w:r>
+                      <w:rPr>
+                        <w:rStyle w:val="PageNumber"/>
+                      </w:rPr>
+                      <w:fldChar w:fldCharType="separate"/>
+                    </w:r>
+                    <w:r>
+                      <w:rPr>
+                        <w:rStyle w:val="PageNumber"/>
+                        <w:noProof/>
+                      </w:rPr>
+                      <w:instrText>1</w:instrText>
+                    </w:r>
+                    <w:r>
+                      <w:rPr>
+                        <w:rStyle w:val="PageNumber"/>
+                      </w:rPr>
+                      <w:fldChar w:fldCharType="end"/>
+                    </w:r>
+                    <w:r>
+                      <w:rPr>
+                        <w:rStyle w:val="PageNumber"/>
+                      </w:rPr>
+                      <w:instrText xml:space="preserve"> PAGE </w:instrText>
+                    </w:r>
+                    <w:r>
+                      <w:rPr>
+                        <w:rStyle w:val="PageNumber"/>
+                      </w:rPr>
+                      <w:fldChar w:fldCharType="separate"/>
+                    </w:r>
+                    <w:r>
+                      <w:rPr>
+                        <w:rStyle w:val="PageNumber"/>
+                        <w:noProof/>
+                      </w:rPr>
+                      <w:t>6</w:t>
+                    </w:r>
+                    <w:r>
+                      <w:rPr>
+                        <w:rStyle w:val="PageNumber"/>
+                      </w:rPr>
+                      <w:fldChar w:fldCharType="end"/>
+                    </w:r>
+                  </w:p>
+                </w:txbxContent>
+              </v:textbox>
+              <w10:wrap anchorx="margin"/>
+            </v:shape>
+          </w:pict>
+        </mc:Fallback>
+      </mc:AlternateContent>
+    </w:r>
+    <w:r>
+      <w:rPr>
+        <w:noProof/>
+      </w:rPr>
+      <mc:AlternateContent>
+        <mc:Choice Requires="wps">
+          <w:drawing>
+            <wp:anchor distT="0" distB="0" distL="114300" distR="114300" simplePos="0" relativeHeight="251680256" behindDoc="0" locked="0" layoutInCell="0" allowOverlap="1" wp14:anchorId="77AB8419" wp14:editId="3E76A448">
               <wp:simplePos x="0" y="0"/>
               <wp:positionH relativeFrom="column">
                 <wp:posOffset>9947910</wp:posOffset>
@@ -575,11 +851,7 @@
         </mc:Choice>
         <mc:Fallback>
           <w:pict>
-            <v:shapetype w14:anchorId="77AB8419" id="_x0000_t202" coordsize="21600,21600" o:spt="202" path="m,l,21600r21600,l21600,xe">
-              <v:stroke joinstyle="miter"/>
-              <v:path gradientshapeok="t" o:connecttype="rect"/>
-            </v:shapetype>
-            <v:shape id="Text Box 573" o:spid="_x0000_s1090" type="#_x0000_t202" style="position:absolute;margin-left:783.3pt;margin-top:-39.75pt;width:186.6pt;height:42.75pt;z-index:251680256;visibility:visible;mso-wrap-style:square;mso-width-percent:0;mso-height-percent:0;mso-wrap-distance-left:9pt;mso-wrap-distance-top:0;mso-wrap-distance-right:9pt;mso-wrap-distance-bottom:0;mso-position-horizontal:absolute;mso-position-horizontal-relative:text;mso-position-vertical:absolute;mso-position-vertical-relative:text;mso-width-percent:0;mso-height-percent:0;mso-width-relative:page;mso-height-relative:page;v-text-anchor:top" o:gfxdata="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" o:allowincell="f" stroked="f" strokeweight="1.25pt">
+            <v:shape w14:anchorId="77AB8419" id="Text Box 573" o:spid="_x0000_s1090" type="#_x0000_t202" style="position:absolute;margin-left:783.3pt;margin-top:-39.75pt;width:186.6pt;height:42.75pt;z-index:251680256;visibility:visible;mso-wrap-style:square;mso-width-percent:0;mso-height-percent:0;mso-wrap-distance-left:9pt;mso-wrap-distance-top:0;mso-wrap-distance-right:9pt;mso-wrap-distance-bottom:0;mso-position-horizontal:absolute;mso-position-horizontal-relative:text;mso-position-vertical:absolute;mso-position-vertical-relative:text;mso-width-percent:0;mso-height-percent:0;mso-width-relative:page;mso-height-relative:page;v-text-anchor:top" o:gfxdata="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" o:allowincell="f" stroked="f" strokeweight="1.25pt">
               <v:textbox>
                 <w:txbxContent>
                   <w:p>
@@ -792,7 +1064,7 @@
             </wp:anchor>
           </w:drawing>
         </mc:Choice>
-        <mc:Fallback xmlns:a14="http://schemas.microsoft.com/office/drawing/2010/main" xmlns:a="http://schemas.openxmlformats.org/drawingml/2006/main">
+        <mc:Fallback xmlns:a="http://schemas.openxmlformats.org/drawingml/2006/main" xmlns:a14="http://schemas.microsoft.com/office/drawing/2010/main">
           <w:pict>
             <v:line id="Line 571" style="position:absolute;z-index:251678208;visibility:visible;mso-wrap-style:square;mso-width-percent:0;mso-height-percent:0;mso-wrap-distance-left:9pt;mso-wrap-distance-top:0;mso-wrap-distance-right:9pt;mso-wrap-distance-bottom:0;mso-position-horizontal:absolute;mso-position-horizontal-relative:text;mso-position-vertical:absolute;mso-position-vertical-relative:text;mso-width-percent:0;mso-height-percent:0;mso-width-relative:page;mso-height-relative:page" o:spid="_x0000_s1026" o:allowincell="f" strokeweight="1pt" o:gfxdata="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" from="1062.4pt,-39.8pt" to="1062.4pt,-9.1pt" w14:anchorId="4A693631"/>
           </w:pict>
@@ -865,7 +1137,7 @@
             </wp:anchor>
           </w:drawing>
         </mc:Choice>
-        <mc:Fallback xmlns:a14="http://schemas.microsoft.com/office/drawing/2010/main" xmlns:a="http://schemas.openxmlformats.org/drawingml/2006/main">
+        <mc:Fallback xmlns:a="http://schemas.openxmlformats.org/drawingml/2006/main" xmlns:a14="http://schemas.microsoft.com/office/drawing/2010/main">
           <w:pict>
             <v:line id="Line 570" style="position:absolute;z-index:251677184;visibility:visible;mso-wrap-style:square;mso-width-percent:0;mso-height-percent:0;mso-wrap-distance-left:9pt;mso-wrap-distance-top:0;mso-wrap-distance-right:9pt;mso-wrap-distance-bottom:0;mso-position-horizontal:absolute;mso-position-horizontal-relative:text;mso-position-vertical:absolute;mso-position-vertical-relative:text;mso-width-percent:0;mso-height-percent:0;mso-width-relative:page;mso-height-relative:page" o:spid="_x0000_s1026" o:allowincell="f" strokeweight="1pt" o:gfxdata="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" from="1020pt,-39.75pt" to="1020pt,-8.95pt" w14:anchorId="3E7C5AD2"/>
           </w:pict>
@@ -938,7 +1210,7 @@
             </wp:anchor>
           </w:drawing>
         </mc:Choice>
-        <mc:Fallback xmlns:a14="http://schemas.microsoft.com/office/drawing/2010/main" xmlns:a="http://schemas.openxmlformats.org/drawingml/2006/main">
+        <mc:Fallback xmlns:a="http://schemas.openxmlformats.org/drawingml/2006/main" xmlns:a14="http://schemas.microsoft.com/office/drawing/2010/main">
           <w:pict>
             <v:line id="Line 569" style="position:absolute;z-index:251676160;visibility:visible;mso-wrap-style:square;mso-width-percent:0;mso-height-percent:0;mso-wrap-distance-left:9pt;mso-wrap-distance-top:0;mso-wrap-distance-right:9pt;mso-wrap-distance-bottom:0;mso-position-horizontal:absolute;mso-position-horizontal-relative:text;mso-position-vertical:absolute;mso-position-vertical-relative:text;mso-width-percent:0;mso-height-percent:0;mso-width-relative:page;mso-height-relative:page" o:spid="_x0000_s1026" o:allowincell="f" strokeweight="1pt" o:gfxdata="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" from="1005.8pt,-23.3pt" to="1005.8pt,-9.35pt" w14:anchorId="64CBADBB"/>
           </w:pict>
@@ -1011,7 +1283,7 @@
             </wp:anchor>
           </w:drawing>
         </mc:Choice>
-        <mc:Fallback xmlns:a14="http://schemas.microsoft.com/office/drawing/2010/main" xmlns:a="http://schemas.openxmlformats.org/drawingml/2006/main">
+        <mc:Fallback xmlns:a="http://schemas.openxmlformats.org/drawingml/2006/main" xmlns:a14="http://schemas.microsoft.com/office/drawing/2010/main">
           <w:pict>
             <v:line id="Line 485" style="position:absolute;z-index:251624960;visibility:visible;mso-wrap-style:square;mso-width-percent:0;mso-height-percent:0;mso-wrap-distance-left:9pt;mso-wrap-distance-top:0;mso-wrap-distance-right:9pt;mso-wrap-distance-bottom:0;mso-position-horizontal:absolute;mso-position-horizontal-relative:text;mso-position-vertical:absolute;mso-position-vertical-relative:text;mso-width-percent:0;mso-height-percent:0;mso-width-relative:page;mso-height-relative:page" o:spid="_x0000_s1026" o:allowincell="f" strokeweight="1pt" o:gfxdata="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" from="977.45pt,-9.15pt" to="1119.45pt,-9.05pt" w14:anchorId="5E01EC1A"/>
           </w:pict>
@@ -1084,7 +1356,7 @@
             </wp:anchor>
           </w:drawing>
         </mc:Choice>
-        <mc:Fallback xmlns:a14="http://schemas.microsoft.com/office/drawing/2010/main" xmlns:a="http://schemas.openxmlformats.org/drawingml/2006/main">
+        <mc:Fallback xmlns:a="http://schemas.openxmlformats.org/drawingml/2006/main" xmlns:a14="http://schemas.microsoft.com/office/drawing/2010/main">
           <w:pict>
             <v:line id="Line 492" style="position:absolute;z-index:251632128;visibility:visible;mso-wrap-style:square;mso-width-percent:0;mso-height-percent:0;mso-wrap-distance-left:9pt;mso-wrap-distance-top:0;mso-wrap-distance-right:9pt;mso-wrap-distance-bottom:0;mso-position-horizontal:absolute;mso-position-horizontal-relative:text;mso-position-vertical:absolute;mso-position-vertical-relative:text;mso-width-percent:0;mso-height-percent:0;mso-width-relative:page;mso-height-relative:page" o:spid="_x0000_s1026" o:allowincell="f" strokeweight="1pt" o:gfxdata="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" from="991.65pt,-23.3pt" to="991.65pt,-9.15pt" w14:anchorId="40B16718"/>
           </w:pict>
@@ -1291,7 +1563,7 @@
             </wp:anchor>
           </w:drawing>
         </mc:Choice>
-        <mc:Fallback xmlns:a14="http://schemas.microsoft.com/office/drawing/2010/main" xmlns:a="http://schemas.openxmlformats.org/drawingml/2006/main">
+        <mc:Fallback xmlns:a="http://schemas.openxmlformats.org/drawingml/2006/main" xmlns:a14="http://schemas.microsoft.com/office/drawing/2010/main">
           <w:pict>
             <v:line id="Line 568" style="position:absolute;z-index:251675136;visibility:visible;mso-wrap-style:square;mso-width-percent:0;mso-height-percent:0;mso-wrap-distance-left:9pt;mso-wrap-distance-top:0;mso-wrap-distance-right:9pt;mso-wrap-distance-bottom:0;mso-position-horizontal:absolute;mso-position-horizontal-relative:text;mso-position-vertical:absolute;mso-position-vertical-relative:text;mso-width-percent:0;mso-height-percent:0;mso-width-relative:page;mso-height-relative:page" o:spid="_x0000_s1026" o:allowincell="f" strokeweight="1pt" o:gfxdata="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" from="977.2pt,-23.25pt" to="1119.2pt,-23.25pt" w14:anchorId="7F4F6251"/>
           </w:pict>
@@ -1418,7 +1690,7 @@
             </wp:anchor>
           </w:drawing>
         </mc:Choice>
-        <mc:Fallback xmlns:a14="http://schemas.microsoft.com/office/drawing/2010/main" xmlns:a="http://schemas.openxmlformats.org/drawingml/2006/main">
+        <mc:Fallback xmlns:a="http://schemas.openxmlformats.org/drawingml/2006/main" xmlns:a14="http://schemas.microsoft.com/office/drawing/2010/main">
           <w:pict>
             <v:line id="Line 504" style="position:absolute;z-index:251644416;visibility:visible;mso-wrap-style:square;mso-width-percent:0;mso-height-percent:0;mso-wrap-distance-left:9pt;mso-wrap-distance-top:0;mso-wrap-distance-right:9pt;mso-wrap-distance-bottom:0;mso-position-horizontal:absolute;mso-position-horizontal-relative:text;mso-position-vertical:absolute;mso-position-vertical-relative:text;mso-width-percent:0;mso-height-percent:0;mso-width-relative:page;mso-height-relative:page" o:spid="_x0000_s1026" o:allowincell="f" strokeweight="1pt" o:gfxdata="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" from="819pt,601.15pt" to="819pt,640.4pt" w14:anchorId="4A23C5A0"/>
           </w:pict>
@@ -1491,7 +1763,7 @@
             </wp:anchor>
           </w:drawing>
         </mc:Choice>
-        <mc:Fallback xmlns:a14="http://schemas.microsoft.com/office/drawing/2010/main" xmlns:a="http://schemas.openxmlformats.org/drawingml/2006/main">
+        <mc:Fallback xmlns:a="http://schemas.openxmlformats.org/drawingml/2006/main" xmlns:a14="http://schemas.microsoft.com/office/drawing/2010/main">
           <w:pict>
             <v:line id="Line 490" style="position:absolute;z-index:251630080;visibility:visible;mso-wrap-style:square;mso-width-percent:0;mso-height-percent:0;mso-wrap-distance-left:9pt;mso-wrap-distance-top:0;mso-wrap-distance-right:9pt;mso-wrap-distance-bottom:0;mso-position-horizontal:absolute;mso-position-horizontal-relative:text;mso-position-vertical:absolute;mso-position-vertical-relative:text;mso-width-percent:0;mso-height-percent:0;mso-width-relative:page;mso-height-relative:page" o:spid="_x0000_s1026" o:allowincell="f" strokeweight="1pt" o:gfxdata="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" from="707.55pt,664.85pt" to="707.55pt,778.7pt" w14:anchorId="7760165B"/>
           </w:pict>
@@ -1564,7 +1836,7 @@
             </wp:anchor>
           </w:drawing>
         </mc:Choice>
-        <mc:Fallback xmlns:a14="http://schemas.microsoft.com/office/drawing/2010/main" xmlns:a="http://schemas.openxmlformats.org/drawingml/2006/main">
+        <mc:Fallback xmlns:a="http://schemas.openxmlformats.org/drawingml/2006/main" xmlns:a14="http://schemas.microsoft.com/office/drawing/2010/main">
           <w:pict>
             <v:line id="Line 503" style="position:absolute;z-index:251643392;visibility:visible;mso-wrap-style:square;mso-width-percent:0;mso-height-percent:0;mso-wrap-distance-left:9pt;mso-wrap-distance-top:0;mso-wrap-distance-right:9pt;mso-wrap-distance-bottom:0;mso-position-horizontal:absolute;mso-position-horizontal-relative:text;mso-position-vertical:absolute;mso-position-vertical-relative:text;mso-width-percent:0;mso-height-percent:0;mso-width-relative:page;mso-height-relative:page" o:spid="_x0000_s1026" o:allowincell="f" strokeweight="1pt" o:gfxdata="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" from="969.95pt,601.05pt" to="969.95pt,640.4pt" w14:anchorId="395B92F7"/>
           </w:pict>
@@ -1817,7 +2089,7 @@
             </wp:anchor>
           </w:drawing>
         </mc:Choice>
-        <mc:Fallback xmlns:a14="http://schemas.microsoft.com/office/drawing/2010/main" xmlns:a="http://schemas.openxmlformats.org/drawingml/2006/main">
+        <mc:Fallback xmlns:a="http://schemas.openxmlformats.org/drawingml/2006/main" xmlns:a14="http://schemas.microsoft.com/office/drawing/2010/main">
           <w:pict>
             <v:rect id="Rectangle 486" style="position:absolute;margin-left:779.75pt;margin-top:636.8pt;width:339.35pt;height:28.05pt;z-index:251625984;visibility:visible;mso-wrap-style:square;mso-width-percent:0;mso-height-percent:0;mso-wrap-distance-left:9pt;mso-wrap-distance-top:0;mso-wrap-distance-right:9pt;mso-wrap-distance-bottom:0;mso-position-horizontal:absolute;mso-position-horizontal-relative:text;mso-position-vertical:absolute;mso-position-vertical-relative:text;mso-width-percent:0;mso-height-percent:0;mso-width-relative:page;mso-height-relative:page;v-text-anchor:top" o:spid="_x0000_s1026" o:allowincell="f" filled="f" strokeweight="1pt" o:gfxdata="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" w14:anchorId="1D4B5490"/>
           </w:pict>
@@ -1887,7 +2159,7 @@
             </wp:anchor>
           </w:drawing>
         </mc:Choice>
-        <mc:Fallback xmlns:a14="http://schemas.microsoft.com/office/drawing/2010/main" xmlns:a="http://schemas.openxmlformats.org/drawingml/2006/main">
+        <mc:Fallback xmlns:a="http://schemas.openxmlformats.org/drawingml/2006/main" xmlns:a14="http://schemas.microsoft.com/office/drawing/2010/main">
           <w:pict>
             <v:rect id="Rectangle 502" style="position:absolute;margin-left:779.9pt;margin-top:601.15pt;width:339.3pt;height:39.25pt;z-index:251642368;visibility:visible;mso-wrap-style:square;mso-width-percent:0;mso-height-percent:0;mso-wrap-distance-left:9pt;mso-wrap-distance-top:0;mso-wrap-distance-right:9pt;mso-wrap-distance-bottom:0;mso-position-horizontal:absolute;mso-position-horizontal-relative:text;mso-position-vertical:absolute;mso-position-vertical-relative:text;mso-width-percent:0;mso-height-percent:0;mso-width-relative:page;mso-height-relative:page;v-text-anchor:top" o:spid="_x0000_s1026" o:allowincell="f" strokeweight="1pt" o:gfxdata="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" w14:anchorId="44883620"/>
           </w:pict>
@@ -5263,282 +5535,7 @@
       <mc:AlternateContent>
         <mc:Choice Requires="wps">
           <w:drawing>
-            <wp:anchor distT="0" distB="0" distL="114300" distR="114300" simplePos="0" relativeHeight="251653632" behindDoc="0" locked="0" layoutInCell="0" allowOverlap="1" wp14:anchorId="36B76F31" wp14:editId="363170C9">
-              <wp:simplePos x="0" y="0"/>
-              <wp:positionH relativeFrom="column">
-                <wp:posOffset>13515340</wp:posOffset>
-              </wp:positionH>
-              <wp:positionV relativeFrom="paragraph">
-                <wp:posOffset>9193530</wp:posOffset>
-              </wp:positionV>
-              <wp:extent cx="673100" cy="158115"/>
-              <wp:effectExtent l="0" t="0" r="0" b="0"/>
-              <wp:wrapNone/>
-              <wp:docPr id="162" name="Text Box 513"/>
-              <wp:cNvGraphicFramePr>
-                <a:graphicFrameLocks xmlns:a="http://schemas.openxmlformats.org/drawingml/2006/main"/>
-              </wp:cNvGraphicFramePr>
-              <a:graphic xmlns:a="http://schemas.openxmlformats.org/drawingml/2006/main">
-                <a:graphicData uri="http://schemas.microsoft.com/office/word/2010/wordprocessingShape">
-                  <wps:wsp>
-                    <wps:cNvSpPr txBox="1">
-                      <a:spLocks noChangeArrowheads="1"/>
-                    </wps:cNvSpPr>
-                    <wps:spPr bwMode="auto">
-                      <a:xfrm>
-                        <a:off x="0" y="0"/>
-                        <a:ext cx="673100" cy="158115"/>
-                      </a:xfrm>
-                      <a:prstGeom prst="rect">
-                        <a:avLst/>
-                      </a:prstGeom>
-                      <a:noFill/>
-                      <a:ln>
-                        <a:noFill/>
-                      </a:ln>
-                      <a:extLst>
-                        <a:ext uri="{909E8E84-426E-40DD-AFC4-6F175D3DCCD1}">
-                          <a14:hiddenFill xmlns:a14="http://schemas.microsoft.com/office/drawing/2010/main">
-                            <a:solidFill>
-                              <a:srgbClr val="FFFFFF"/>
-                            </a:solidFill>
-                          </a14:hiddenFill>
-                        </a:ext>
-                        <a:ext uri="{91240B29-F687-4F45-9708-019B960494DF}">
-                          <a14:hiddenLine xmlns:a14="http://schemas.microsoft.com/office/drawing/2010/main" w="15875">
-                            <a:solidFill>
-                              <a:srgbClr val="000000"/>
-                            </a:solidFill>
-                            <a:miter lim="800000"/>
-                            <a:headEnd/>
-                            <a:tailEnd/>
-                          </a14:hiddenLine>
-                        </a:ext>
-                      </a:extLst>
-                    </wps:spPr>
-                    <wps:txbx>
-                      <w:txbxContent>
-                        <w:p>
-                          <w:pPr>
-                            <w:jc w:val="center"/>
-                            <w:rPr>
-                              <w:lang w:val="en-US"/>
-                            </w:rPr>
-                          </w:pPr>
-                          <w:r>
-                            <w:rPr>
-                              <w:lang w:val="en-US"/>
-                            </w:rPr>
-                            <w:t>&lt;</w:t>
-                          </w:r>
-                          <w:proofErr w:type="spellStart"/>
-                          <w:r>
-                            <w:rPr>
-                              <w:lang w:val="en-US"/>
-                            </w:rPr>
-                            <w:t>SCount</w:t>
-                          </w:r>
-                          <w:proofErr w:type="spellEnd"/>
-                          <w:r>
-                            <w:rPr>
-                              <w:lang w:val="en-US"/>
-                            </w:rPr>
-                            <w:t>&gt;</w:t>
-                          </w:r>
-                        </w:p>
-                        <w:p>
-                          <w:r>
-                            <w:rPr>
-                              <w:rStyle w:val="PageNumber"/>
-                            </w:rPr>
-                            <w:fldChar w:fldCharType="begin"/>
-                          </w:r>
-                          <w:r>
-                            <w:rPr>
-                              <w:rStyle w:val="PageNumber"/>
-                            </w:rPr>
-                            <w:fldChar w:fldCharType="begin"/>
-                          </w:r>
-                          <w:r>
-                            <w:rPr>
-                              <w:rStyle w:val="PageNumber"/>
-                            </w:rPr>
-                            <w:instrText xml:space="preserve"> PAGE </w:instrText>
-                          </w:r>
-                          <w:r>
-                            <w:rPr>
-                              <w:rStyle w:val="PageNumber"/>
-                            </w:rPr>
-                            <w:fldChar w:fldCharType="separate"/>
-                          </w:r>
-                          <w:r>
-                            <w:rPr>
-                              <w:rStyle w:val="PageNumber"/>
-                              <w:noProof/>
-                            </w:rPr>
-                            <w:instrText>1</w:instrText>
-                          </w:r>
-                          <w:r>
-                            <w:rPr>
-                              <w:rStyle w:val="PageNumber"/>
-                            </w:rPr>
-                            <w:fldChar w:fldCharType="end"/>
-                          </w:r>
-                          <w:r>
-                            <w:rPr>
-                              <w:rStyle w:val="PageNumber"/>
-                            </w:rPr>
-                            <w:instrText xml:space="preserve"> PAGE </w:instrText>
-                          </w:r>
-                          <w:r>
-                            <w:rPr>
-                              <w:rStyle w:val="PageNumber"/>
-                            </w:rPr>
-                            <w:fldChar w:fldCharType="separate"/>
-                          </w:r>
-                          <w:r>
-                            <w:rPr>
-                              <w:rStyle w:val="PageNumber"/>
-                              <w:noProof/>
-                            </w:rPr>
-                            <w:t>6</w:t>
-                          </w:r>
-                          <w:r>
-                            <w:rPr>
-                              <w:rStyle w:val="PageNumber"/>
-                            </w:rPr>
-                            <w:fldChar w:fldCharType="end"/>
-                          </w:r>
-                        </w:p>
-                      </w:txbxContent>
-                    </wps:txbx>
-                    <wps:bodyPr rot="0" vert="horz" wrap="square" lIns="0" tIns="0" rIns="0" bIns="0" anchor="t" anchorCtr="0" upright="1">
-                      <a:noAutofit/>
-                    </wps:bodyPr>
-                  </wps:wsp>
-                </a:graphicData>
-              </a:graphic>
-              <wp14:sizeRelH relativeFrom="page">
-                <wp14:pctWidth>0</wp14:pctWidth>
-              </wp14:sizeRelH>
-              <wp14:sizeRelV relativeFrom="page">
-                <wp14:pctHeight>0</wp14:pctHeight>
-              </wp14:sizeRelV>
-            </wp:anchor>
-          </w:drawing>
-        </mc:Choice>
-        <mc:Fallback>
-          <w:pict>
-            <v:shape w14:anchorId="36B76F31" id="Text Box 513" o:spid="_x0000_s1067" type="#_x0000_t202" style="position:absolute;margin-left:1064.2pt;margin-top:723.9pt;width:53pt;height:12.45pt;z-index:251653632;visibility:visible;mso-wrap-style:square;mso-width-percent:0;mso-height-percent:0;mso-wrap-distance-left:9pt;mso-wrap-distance-top:0;mso-wrap-distance-right:9pt;mso-wrap-distance-bottom:0;mso-position-horizontal:absolute;mso-position-horizontal-relative:text;mso-position-vertical:absolute;mso-position-vertical-relative:text;mso-width-percent:0;mso-height-percent:0;mso-width-relative:page;mso-height-relative:page;v-text-anchor:top" o:gfxdata="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" o:allowincell="f" filled="f" stroked="f" strokeweight="1.25pt">
-              <v:textbox inset="0,0,0,0">
-                <w:txbxContent>
-                  <w:p>
-                    <w:pPr>
-                      <w:jc w:val="center"/>
-                      <w:rPr>
-                        <w:lang w:val="en-US"/>
-                      </w:rPr>
-                    </w:pPr>
-                    <w:r>
-                      <w:rPr>
-                        <w:lang w:val="en-US"/>
-                      </w:rPr>
-                      <w:t>&lt;</w:t>
-                    </w:r>
-                    <w:proofErr w:type="spellStart"/>
-                    <w:r>
-                      <w:rPr>
-                        <w:lang w:val="en-US"/>
-                      </w:rPr>
-                      <w:t>SCount</w:t>
-                    </w:r>
-                    <w:proofErr w:type="spellEnd"/>
-                    <w:r>
-                      <w:rPr>
-                        <w:lang w:val="en-US"/>
-                      </w:rPr>
-                      <w:t>&gt;</w:t>
-                    </w:r>
-                  </w:p>
-                  <w:p>
-                    <w:r>
-                      <w:rPr>
-                        <w:rStyle w:val="PageNumber"/>
-                      </w:rPr>
-                      <w:fldChar w:fldCharType="begin"/>
-                    </w:r>
-                    <w:r>
-                      <w:rPr>
-                        <w:rStyle w:val="PageNumber"/>
-                      </w:rPr>
-                      <w:fldChar w:fldCharType="begin"/>
-                    </w:r>
-                    <w:r>
-                      <w:rPr>
-                        <w:rStyle w:val="PageNumber"/>
-                      </w:rPr>
-                      <w:instrText xml:space="preserve"> PAGE </w:instrText>
-                    </w:r>
-                    <w:r>
-                      <w:rPr>
-                        <w:rStyle w:val="PageNumber"/>
-                      </w:rPr>
-                      <w:fldChar w:fldCharType="separate"/>
-                    </w:r>
-                    <w:r>
-                      <w:rPr>
-                        <w:rStyle w:val="PageNumber"/>
-                        <w:noProof/>
-                      </w:rPr>
-                      <w:instrText>1</w:instrText>
-                    </w:r>
-                    <w:r>
-                      <w:rPr>
-                        <w:rStyle w:val="PageNumber"/>
-                      </w:rPr>
-                      <w:fldChar w:fldCharType="end"/>
-                    </w:r>
-                    <w:r>
-                      <w:rPr>
-                        <w:rStyle w:val="PageNumber"/>
-                      </w:rPr>
-                      <w:instrText xml:space="preserve"> PAGE </w:instrText>
-                    </w:r>
-                    <w:r>
-                      <w:rPr>
-                        <w:rStyle w:val="PageNumber"/>
-                      </w:rPr>
-                      <w:fldChar w:fldCharType="separate"/>
-                    </w:r>
-                    <w:r>
-                      <w:rPr>
-                        <w:rStyle w:val="PageNumber"/>
-                        <w:noProof/>
-                      </w:rPr>
-                      <w:t>6</w:t>
-                    </w:r>
-                    <w:r>
-                      <w:rPr>
-                        <w:rStyle w:val="PageNumber"/>
-                      </w:rPr>
-                      <w:fldChar w:fldCharType="end"/>
-                    </w:r>
-                  </w:p>
-                </w:txbxContent>
-              </v:textbox>
-            </v:shape>
-          </w:pict>
-        </mc:Fallback>
-      </mc:AlternateContent>
-    </w:r>
-    <w:r>
-      <w:rPr>
-        <w:noProof/>
-      </w:rPr>
-      <mc:AlternateContent>
-        <mc:Choice Requires="wps">
-          <w:drawing>
-            <wp:anchor distT="0" distB="0" distL="114300" distR="114300" simplePos="0" relativeHeight="251652608" behindDoc="0" locked="0" layoutInCell="0" allowOverlap="1" wp14:anchorId="21C09B86" wp14:editId="751B289C">
+            <wp:anchor distT="0" distB="0" distL="114300" distR="114300" simplePos="0" relativeHeight="251652608" behindDoc="0" locked="0" layoutInCell="0" allowOverlap="1" wp14:anchorId="21C09B86" wp14:editId="1B54939A">
               <wp:simplePos x="0" y="0"/>
               <wp:positionH relativeFrom="column">
                 <wp:posOffset>12985750</wp:posOffset>
@@ -5620,7 +5617,7 @@
         </mc:Choice>
         <mc:Fallback>
           <w:pict>
-            <v:shape w14:anchorId="21C09B86" id="Text Box 512" o:spid="_x0000_s1068" type="#_x0000_t202" style="position:absolute;margin-left:1022.5pt;margin-top:723.9pt;width:37.6pt;height:12.45pt;z-index:251652608;visibility:visible;mso-wrap-style:square;mso-width-percent:0;mso-height-percent:0;mso-wrap-distance-left:9pt;mso-wrap-distance-top:0;mso-wrap-distance-right:9pt;mso-wrap-distance-bottom:0;mso-position-horizontal:absolute;mso-position-horizontal-relative:text;mso-position-vertical:absolute;mso-position-vertical-relative:text;mso-width-percent:0;mso-height-percent:0;mso-width-relative:page;mso-height-relative:page;v-text-anchor:top" o:gfxdata="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" o:allowincell="f" filled="f" stroked="f" strokeweight="1.25pt">
+            <v:shape w14:anchorId="21C09B86" id="Text Box 512" o:spid="_x0000_s1067" type="#_x0000_t202" style="position:absolute;margin-left:1022.5pt;margin-top:723.9pt;width:37.6pt;height:12.45pt;z-index:251652608;visibility:visible;mso-wrap-style:square;mso-width-percent:0;mso-height-percent:0;mso-wrap-distance-left:9pt;mso-wrap-distance-top:0;mso-wrap-distance-right:9pt;mso-wrap-distance-bottom:0;mso-position-horizontal:absolute;mso-position-horizontal-relative:text;mso-position-vertical:absolute;mso-position-vertical-relative:text;mso-width-percent:0;mso-height-percent:0;mso-width-relative:page;mso-height-relative:page;v-text-anchor:top" o:gfxdata="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" o:allowincell="f" filled="f" stroked="f" strokeweight="1.25pt">
               <v:textbox inset="0,0,0,0">
                 <w:txbxContent>
                   <w:p>
@@ -5723,7 +5720,7 @@
         </mc:Choice>
         <mc:Fallback>
           <w:pict>
-            <v:shape w14:anchorId="2DF1ED12" id="Text Box 511" o:spid="_x0000_s1069" type="#_x0000_t202" style="position:absolute;margin-left:784.9pt;margin-top:645.8pt;width:331.3pt;height:14.25pt;z-index:251651584;visibility:visible;mso-wrap-style:square;mso-width-percent:0;mso-height-percent:0;mso-wrap-distance-left:9pt;mso-wrap-distance-top:0;mso-wrap-distance-right:9pt;mso-wrap-distance-bottom:0;mso-position-horizontal:absolute;mso-position-horizontal-relative:text;mso-position-vertical:absolute;mso-position-vertical-relative:text;mso-width-percent:0;mso-height-percent:0;mso-width-relative:page;mso-height-relative:page;v-text-anchor:top" o:gfxdata="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" o:allowincell="f" stroked="f" strokeweight="1.25pt">
+            <v:shape w14:anchorId="2DF1ED12" id="Text Box 511" o:spid="_x0000_s1068" type="#_x0000_t202" style="position:absolute;margin-left:784.9pt;margin-top:645.8pt;width:331.3pt;height:14.25pt;z-index:251651584;visibility:visible;mso-wrap-style:square;mso-width-percent:0;mso-height-percent:0;mso-wrap-distance-left:9pt;mso-wrap-distance-top:0;mso-wrap-distance-right:9pt;mso-wrap-distance-bottom:0;mso-position-horizontal:absolute;mso-position-horizontal-relative:text;mso-position-vertical:absolute;mso-position-vertical-relative:text;mso-width-percent:0;mso-height-percent:0;mso-width-relative:page;mso-height-relative:page;v-text-anchor:top" o:gfxdata="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" o:allowincell="f" stroked="f" strokeweight="1.25pt">
               <v:textbox inset="0,0,0,0">
                 <w:txbxContent>
                   <w:p>
@@ -5827,7 +5824,7 @@
         </mc:Choice>
         <mc:Fallback>
           <w:pict>
-            <v:shape w14:anchorId="403BCE7F" id="Text Box 510" o:spid="_x0000_s1070" type="#_x0000_t202" style="position:absolute;margin-left:783.25pt;margin-top:756.7pt;width:187.8pt;height:20.95pt;z-index:251650560;visibility:visible;mso-wrap-style:square;mso-width-percent:0;mso-height-percent:0;mso-wrap-distance-left:9pt;mso-wrap-distance-top:0;mso-wrap-distance-right:9pt;mso-wrap-distance-bottom:0;mso-position-horizontal:absolute;mso-position-horizontal-relative:text;mso-position-vertical:absolute;mso-position-vertical-relative:text;mso-width-percent:0;mso-height-percent:0;mso-width-relative:page;mso-height-relative:page;v-text-anchor:top" o:gfxdata="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" o:allowincell="f" stroked="f" strokeweight="1.25pt">
+            <v:shape w14:anchorId="403BCE7F" id="Text Box 510" o:spid="_x0000_s1069" type="#_x0000_t202" style="position:absolute;margin-left:783.25pt;margin-top:756.7pt;width:187.8pt;height:20.95pt;z-index:251650560;visibility:visible;mso-wrap-style:square;mso-width-percent:0;mso-height-percent:0;mso-wrap-distance-left:9pt;mso-wrap-distance-top:0;mso-wrap-distance-right:9pt;mso-wrap-distance-bottom:0;mso-position-horizontal:absolute;mso-position-horizontal-relative:text;mso-position-vertical:absolute;mso-position-vertical-relative:text;mso-width-percent:0;mso-height-percent:0;mso-width-relative:page;mso-height-relative:page;v-text-anchor:top" o:gfxdata="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" o:allowincell="f" stroked="f" strokeweight="1.25pt">
               <v:textbox>
                 <w:txbxContent>
                   <w:p>
@@ -5931,7 +5928,7 @@
         </mc:Choice>
         <mc:Fallback>
           <w:pict>
-            <v:shape w14:anchorId="7A00FA70" id="Text Box 509" o:spid="_x0000_s1071" type="#_x0000_t202" style="position:absolute;margin-left:784pt;margin-top:721.45pt;width:190.05pt;height:29.25pt;z-index:251649536;visibility:visible;mso-wrap-style:square;mso-width-percent:0;mso-height-percent:0;mso-wrap-distance-left:9pt;mso-wrap-distance-top:0;mso-wrap-distance-right:9pt;mso-wrap-distance-bottom:0;mso-position-horizontal:absolute;mso-position-horizontal-relative:text;mso-position-vertical:absolute;mso-position-vertical-relative:text;mso-width-percent:0;mso-height-percent:0;mso-width-relative:page;mso-height-relative:page;v-text-anchor:top" o:gfxdata="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" o:allowincell="f" stroked="f" strokeweight="1.25pt">
+            <v:shape w14:anchorId="7A00FA70" id="Text Box 509" o:spid="_x0000_s1070" type="#_x0000_t202" style="position:absolute;margin-left:784pt;margin-top:721.45pt;width:190.05pt;height:29.25pt;z-index:251649536;visibility:visible;mso-wrap-style:square;mso-width-percent:0;mso-height-percent:0;mso-wrap-distance-left:9pt;mso-wrap-distance-top:0;mso-wrap-distance-right:9pt;mso-wrap-distance-bottom:0;mso-position-horizontal:absolute;mso-position-horizontal-relative:text;mso-position-vertical:absolute;mso-position-vertical-relative:text;mso-width-percent:0;mso-height-percent:0;mso-width-relative:page;mso-height-relative:page;v-text-anchor:top" o:gfxdata="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" o:allowincell="f" stroked="f" strokeweight="1.25pt">
               <v:textbox>
                 <w:txbxContent>
                   <w:p>
@@ -6035,7 +6032,7 @@
         </mc:Choice>
         <mc:Fallback>
           <w:pict>
-            <v:shape w14:anchorId="66F911C0" id="Text Box 507" o:spid="_x0000_s1072" type="#_x0000_t202" style="position:absolute;margin-left:972.55pt;margin-top:613.6pt;width:144.25pt;height:24.2pt;z-index:251647488;visibility:visible;mso-wrap-style:square;mso-width-percent:0;mso-height-percent:0;mso-wrap-distance-left:9pt;mso-wrap-distance-top:0;mso-wrap-distance-right:9pt;mso-wrap-distance-bottom:0;mso-position-horizontal:absolute;mso-position-horizontal-relative:text;mso-position-vertical:absolute;mso-position-vertical-relative:text;mso-width-percent:0;mso-height-percent:0;mso-width-relative:page;mso-height-relative:page;v-text-anchor:top" o:gfxdata="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" o:allowincell="f" stroked="f" strokeweight="1.25pt">
+            <v:shape w14:anchorId="66F911C0" id="Text Box 507" o:spid="_x0000_s1071" type="#_x0000_t202" style="position:absolute;margin-left:972.55pt;margin-top:613.6pt;width:144.25pt;height:24.2pt;z-index:251647488;visibility:visible;mso-wrap-style:square;mso-width-percent:0;mso-height-percent:0;mso-wrap-distance-left:9pt;mso-wrap-distance-top:0;mso-wrap-distance-right:9pt;mso-wrap-distance-bottom:0;mso-position-horizontal:absolute;mso-position-horizontal-relative:text;mso-position-vertical:absolute;mso-position-vertical-relative:text;mso-width-percent:0;mso-height-percent:0;mso-width-relative:page;mso-height-relative:page;v-text-anchor:top" o:gfxdata="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" o:allowincell="f" stroked="f" strokeweight="1.25pt">
               <v:textbox inset="0,0,0,0">
                 <w:txbxContent>
                   <w:p>
@@ -6139,7 +6136,7 @@
         </mc:Choice>
         <mc:Fallback>
           <w:pict>
-            <v:shape w14:anchorId="133394CB" id="Text Box 506" o:spid="_x0000_s1073" type="#_x0000_t202" style="position:absolute;margin-left:821.7pt;margin-top:612.85pt;width:145pt;height:24.7pt;z-index:251646464;visibility:visible;mso-wrap-style:square;mso-width-percent:0;mso-height-percent:0;mso-wrap-distance-left:9pt;mso-wrap-distance-top:0;mso-wrap-distance-right:9pt;mso-wrap-distance-bottom:0;mso-position-horizontal:absolute;mso-position-horizontal-relative:text;mso-position-vertical:absolute;mso-position-vertical-relative:text;mso-width-percent:0;mso-height-percent:0;mso-width-relative:page;mso-height-relative:page;v-text-anchor:top" o:gfxdata="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" o:allowincell="f" stroked="f" strokeweight="1.25pt">
+            <v:shape w14:anchorId="133394CB" id="Text Box 506" o:spid="_x0000_s1072" type="#_x0000_t202" style="position:absolute;margin-left:821.7pt;margin-top:612.85pt;width:145pt;height:24.7pt;z-index:251646464;visibility:visible;mso-wrap-style:square;mso-width-percent:0;mso-height-percent:0;mso-wrap-distance-left:9pt;mso-wrap-distance-top:0;mso-wrap-distance-right:9pt;mso-wrap-distance-bottom:0;mso-position-horizontal:absolute;mso-position-horizontal-relative:text;mso-position-vertical:absolute;mso-position-vertical-relative:text;mso-width-percent:0;mso-height-percent:0;mso-width-relative:page;mso-height-relative:page;v-text-anchor:top" o:gfxdata="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" o:allowincell="f" stroked="f" strokeweight="1.25pt">
               <v:textbox inset="0,0,0,0">
                 <w:txbxContent>
                   <w:p>
@@ -6243,7 +6240,7 @@
         </mc:Choice>
         <mc:Fallback>
           <w:pict>
-            <v:shape w14:anchorId="77A36AC4" id="Text Box 505" o:spid="_x0000_s1074" type="#_x0000_t202" style="position:absolute;margin-left:783.25pt;margin-top:612.85pt;width:32.3pt;height:23.95pt;z-index:251645440;visibility:visible;mso-wrap-style:square;mso-width-percent:0;mso-height-percent:0;mso-wrap-distance-left:9pt;mso-wrap-distance-top:0;mso-wrap-distance-right:9pt;mso-wrap-distance-bottom:0;mso-position-horizontal:absolute;mso-position-horizontal-relative:text;mso-position-vertical:absolute;mso-position-vertical-relative:text;mso-width-percent:0;mso-height-percent:0;mso-width-relative:page;mso-height-relative:page;v-text-anchor:top" o:gfxdata="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" o:allowincell="f" stroked="f" strokeweight="1.25pt">
+            <v:shape w14:anchorId="77A36AC4" id="Text Box 505" o:spid="_x0000_s1073" type="#_x0000_t202" style="position:absolute;margin-left:783.25pt;margin-top:612.85pt;width:32.3pt;height:23.95pt;z-index:251645440;visibility:visible;mso-wrap-style:square;mso-width-percent:0;mso-height-percent:0;mso-wrap-distance-left:9pt;mso-wrap-distance-top:0;mso-wrap-distance-right:9pt;mso-wrap-distance-bottom:0;mso-position-horizontal:absolute;mso-position-horizontal-relative:text;mso-position-vertical:absolute;mso-position-vertical-relative:text;mso-width-percent:0;mso-height-percent:0;mso-width-relative:page;mso-height-relative:page;v-text-anchor:top" o:gfxdata="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" o:allowincell="f" stroked="f" strokeweight="1.25pt">
               <v:textbox inset="0,0,0,0">
                 <w:txbxContent>
                   <w:p>
@@ -6328,7 +6325,7 @@
             </wp:anchor>
           </w:drawing>
         </mc:Choice>
-        <mc:Fallback xmlns:a14="http://schemas.microsoft.com/office/drawing/2010/main" xmlns:a="http://schemas.openxmlformats.org/drawingml/2006/main">
+        <mc:Fallback xmlns:a="http://schemas.openxmlformats.org/drawingml/2006/main" xmlns:a14="http://schemas.microsoft.com/office/drawing/2010/main">
           <w:pict>
             <v:line id="Line 501" style="position:absolute;z-index:251641344;visibility:visible;mso-wrap-style:square;mso-width-percent:0;mso-height-percent:0;mso-wrap-distance-left:9pt;mso-wrap-distance-top:0;mso-wrap-distance-right:9pt;mso-wrap-distance-bottom:0;mso-position-horizontal:absolute;mso-position-horizontal-relative:text;mso-position-vertical:absolute;mso-position-vertical-relative:text;mso-width-percent:0;mso-height-percent:0;mso-width-relative:page;mso-height-relative:page" o:spid="_x0000_s1026" o:allowincell="f" strokeweight="1pt" o:gfxdata="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" from="593.65pt,778.45pt" to="780.25pt,778.45pt" w14:anchorId="64EF0005"/>
           </w:pict>
@@ -6401,7 +6398,7 @@
             </wp:anchor>
           </w:drawing>
         </mc:Choice>
-        <mc:Fallback xmlns:a14="http://schemas.microsoft.com/office/drawing/2010/main" xmlns:a="http://schemas.openxmlformats.org/drawingml/2006/main">
+        <mc:Fallback xmlns:a="http://schemas.openxmlformats.org/drawingml/2006/main" xmlns:a14="http://schemas.microsoft.com/office/drawing/2010/main">
           <w:pict>
             <v:line id="Line 500" style="position:absolute;z-index:251640320;visibility:visible;mso-wrap-style:square;mso-width-percent:0;mso-height-percent:0;mso-wrap-distance-left:9pt;mso-wrap-distance-top:0;mso-wrap-distance-right:9pt;mso-wrap-distance-bottom:0;mso-position-horizontal:absolute;mso-position-horizontal-relative:text;mso-position-vertical:absolute;mso-position-vertical-relative:text;mso-width-percent:0;mso-height-percent:0;mso-width-relative:page;mso-height-relative:page" o:spid="_x0000_s1026" o:allowincell="f" strokeweight="1pt" o:gfxdata="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" from="593.15pt,664.85pt" to="779pt,664.85pt" w14:anchorId="491197E9"/>
           </w:pict>
@@ -6504,7 +6501,7 @@
         </mc:Choice>
         <mc:Fallback>
           <w:pict>
-            <v:shape w14:anchorId="21542D17" id="Text Box 499" o:spid="_x0000_s1075" type="#_x0000_t202" style="position:absolute;margin-left:1063.2pt;margin-top:708.25pt;width:55.3pt;height:12.45pt;z-index:251639296;visibility:visible;mso-wrap-style:square;mso-width-percent:0;mso-height-percent:0;mso-wrap-distance-left:9pt;mso-wrap-distance-top:0;mso-wrap-distance-right:9pt;mso-wrap-distance-bottom:0;mso-position-horizontal:absolute;mso-position-horizontal-relative:text;mso-position-vertical:absolute;mso-position-vertical-relative:text;mso-width-percent:0;mso-height-percent:0;mso-width-relative:page;mso-height-relative:page;v-text-anchor:top" o:gfxdata="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" o:allowincell="f" filled="f" stroked="f" strokeweight="1pt">
+            <v:shape w14:anchorId="21542D17" id="Text Box 499" o:spid="_x0000_s1074" type="#_x0000_t202" style="position:absolute;margin-left:1063.2pt;margin-top:708.25pt;width:55.3pt;height:12.45pt;z-index:251639296;visibility:visible;mso-wrap-style:square;mso-width-percent:0;mso-height-percent:0;mso-wrap-distance-left:9pt;mso-wrap-distance-top:0;mso-wrap-distance-right:9pt;mso-wrap-distance-bottom:0;mso-position-horizontal:absolute;mso-position-horizontal-relative:text;mso-position-vertical:absolute;mso-position-vertical-relative:text;mso-width-percent:0;mso-height-percent:0;mso-width-relative:page;mso-height-relative:page;v-text-anchor:top" o:gfxdata="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" o:allowincell="f" filled="f" stroked="f" strokeweight="1pt">
               <v:textbox inset="0,0,0,0">
                 <w:txbxContent>
                   <w:p>
@@ -6624,7 +6621,7 @@
         </mc:Choice>
         <mc:Fallback>
           <w:pict>
-            <v:shape w14:anchorId="397F3B8D" id="Text Box 498" o:spid="_x0000_s1076" type="#_x0000_t202" style="position:absolute;margin-left:977.8pt;margin-top:708.3pt;width:41.85pt;height:12.45pt;z-index:251638272;visibility:visible;mso-wrap-style:square;mso-width-percent:0;mso-height-percent:0;mso-wrap-distance-left:9pt;mso-wrap-distance-top:0;mso-wrap-distance-right:9pt;mso-wrap-distance-bottom:0;mso-position-horizontal:absolute;mso-position-horizontal-relative:text;mso-position-vertical:absolute;mso-position-vertical-relative:text;mso-width-percent:0;mso-height-percent:0;mso-width-relative:page;mso-height-relative:page;v-text-anchor:top" o:gfxdata="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" o:allowincell="f" filled="f" stroked="f" strokeweight="1pt">
+            <v:shape w14:anchorId="397F3B8D" id="Text Box 498" o:spid="_x0000_s1075" type="#_x0000_t202" style="position:absolute;margin-left:977.8pt;margin-top:708.3pt;width:41.85pt;height:12.45pt;z-index:251638272;visibility:visible;mso-wrap-style:square;mso-width-percent:0;mso-height-percent:0;mso-wrap-distance-left:9pt;mso-wrap-distance-top:0;mso-wrap-distance-right:9pt;mso-wrap-distance-bottom:0;mso-position-horizontal:absolute;mso-position-horizontal-relative:text;mso-position-vertical:absolute;mso-position-vertical-relative:text;mso-width-percent:0;mso-height-percent:0;mso-width-relative:page;mso-height-relative:page;v-text-anchor:top" o:gfxdata="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" o:allowincell="f" filled="f" stroked="f" strokeweight="1pt">
               <v:textbox inset="0,0,0,0">
                 <w:txbxContent>
                   <w:p>
@@ -6743,7 +6740,7 @@
         </mc:Choice>
         <mc:Fallback>
           <w:pict>
-            <v:shape w14:anchorId="18B94986" id="Text Box 497" o:spid="_x0000_s1077" type="#_x0000_t202" style="position:absolute;margin-left:751.75pt;margin-top:694.75pt;width:25.85pt;height:12.45pt;z-index:251637248;visibility:visible;mso-wrap-style:square;mso-width-percent:0;mso-height-percent:0;mso-wrap-distance-left:9pt;mso-wrap-distance-top:0;mso-wrap-distance-right:9pt;mso-wrap-distance-bottom:0;mso-position-horizontal:absolute;mso-position-horizontal-relative:text;mso-position-vertical:absolute;mso-position-vertical-relative:text;mso-width-percent:0;mso-height-percent:0;mso-width-relative:page;mso-height-relative:page;v-text-anchor:top" o:gfxdata="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" o:allowincell="f" filled="f" stroked="f" strokeweight="1pt">
+            <v:shape w14:anchorId="18B94986" id="Text Box 497" o:spid="_x0000_s1076" type="#_x0000_t202" style="position:absolute;margin-left:751.75pt;margin-top:694.75pt;width:25.85pt;height:12.45pt;z-index:251637248;visibility:visible;mso-wrap-style:square;mso-width-percent:0;mso-height-percent:0;mso-wrap-distance-left:9pt;mso-wrap-distance-top:0;mso-wrap-distance-right:9pt;mso-wrap-distance-bottom:0;mso-position-horizontal:absolute;mso-position-horizontal-relative:text;mso-position-vertical:absolute;mso-position-vertical-relative:text;mso-width-percent:0;mso-height-percent:0;mso-width-relative:page;mso-height-relative:page;v-text-anchor:top" o:gfxdata="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" o:allowincell="f" filled="f" stroked="f" strokeweight="1pt">
               <v:textbox inset="0,0,0,0">
                 <w:txbxContent>
                   <w:p>
@@ -6863,7 +6860,7 @@
         </mc:Choice>
         <mc:Fallback>
           <w:pict>
-            <v:shape w14:anchorId="00D0F4C6" id="Text Box 496" o:spid="_x0000_s1078" type="#_x0000_t202" style="position:absolute;margin-left:709.4pt;margin-top:694.75pt;width:37.7pt;height:12.45pt;z-index:251636224;visibility:visible;mso-wrap-style:square;mso-width-percent:0;mso-height-percent:0;mso-wrap-distance-left:9pt;mso-wrap-distance-top:0;mso-wrap-distance-right:9pt;mso-wrap-distance-bottom:0;mso-position-horizontal:absolute;mso-position-horizontal-relative:text;mso-position-vertical:absolute;mso-position-vertical-relative:text;mso-width-percent:0;mso-height-percent:0;mso-width-relative:page;mso-height-relative:page;v-text-anchor:top" o:gfxdata="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" o:allowincell="f" filled="f" stroked="f" strokeweight="1pt">
+            <v:shape w14:anchorId="00D0F4C6" id="Text Box 496" o:spid="_x0000_s1077" type="#_x0000_t202" style="position:absolute;margin-left:709.4pt;margin-top:694.75pt;width:37.7pt;height:12.45pt;z-index:251636224;visibility:visible;mso-wrap-style:square;mso-width-percent:0;mso-height-percent:0;mso-wrap-distance-left:9pt;mso-wrap-distance-top:0;mso-wrap-distance-right:9pt;mso-wrap-distance-bottom:0;mso-position-horizontal:absolute;mso-position-horizontal-relative:text;mso-position-vertical:absolute;mso-position-vertical-relative:text;mso-width-percent:0;mso-height-percent:0;mso-width-relative:page;mso-height-relative:page;v-text-anchor:top" o:gfxdata="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" o:allowincell="f" filled="f" stroked="f" strokeweight="1pt">
               <v:textbox inset="0,0,0,0">
                 <w:txbxContent>
                   <w:p>
@@ -6983,7 +6980,7 @@
         </mc:Choice>
         <mc:Fallback>
           <w:pict>
-            <v:shape w14:anchorId="37E57D6C" id="Text Box 495" o:spid="_x0000_s1079" type="#_x0000_t202" style="position:absolute;margin-left:644.95pt;margin-top:694.75pt;width:58.9pt;height:12.45pt;z-index:251635200;visibility:visible;mso-wrap-style:square;mso-width-percent:0;mso-height-percent:0;mso-wrap-distance-left:9pt;mso-wrap-distance-top:0;mso-wrap-distance-right:9pt;mso-wrap-distance-bottom:0;mso-position-horizontal:absolute;mso-position-horizontal-relative:text;mso-position-vertical:absolute;mso-position-vertical-relative:text;mso-width-percent:0;mso-height-percent:0;mso-width-relative:page;mso-height-relative:page;v-text-anchor:top" o:gfxdata="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" o:allowincell="f" filled="f" stroked="f" strokeweight="1pt">
+            <v:shape w14:anchorId="37E57D6C" id="Text Box 495" o:spid="_x0000_s1078" type="#_x0000_t202" style="position:absolute;margin-left:644.95pt;margin-top:694.75pt;width:58.9pt;height:12.45pt;z-index:251635200;visibility:visible;mso-wrap-style:square;mso-width-percent:0;mso-height-percent:0;mso-wrap-distance-left:9pt;mso-wrap-distance-top:0;mso-wrap-distance-right:9pt;mso-wrap-distance-bottom:0;mso-position-horizontal:absolute;mso-position-horizontal-relative:text;mso-position-vertical:absolute;mso-position-vertical-relative:text;mso-width-percent:0;mso-height-percent:0;mso-width-relative:page;mso-height-relative:page;v-text-anchor:top" o:gfxdata="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" o:allowincell="f" filled="f" stroked="f" strokeweight="1pt">
               <v:textbox inset="0,0,0,0">
                 <w:txbxContent>
                   <w:p>
@@ -7099,7 +7096,7 @@
         </mc:Choice>
         <mc:Fallback>
           <w:pict>
-            <v:shape w14:anchorId="5422BA56" id="Text Box 494" o:spid="_x0000_s1080" type="#_x0000_t202" style="position:absolute;margin-left:614.55pt;margin-top:694.75pt;width:26.85pt;height:12.45pt;z-index:251634176;visibility:visible;mso-wrap-style:square;mso-width-percent:0;mso-height-percent:0;mso-wrap-distance-left:9pt;mso-wrap-distance-top:0;mso-wrap-distance-right:9pt;mso-wrap-distance-bottom:0;mso-position-horizontal:absolute;mso-position-horizontal-relative:text;mso-position-vertical:absolute;mso-position-vertical-relative:text;mso-width-percent:0;mso-height-percent:0;mso-width-relative:page;mso-height-relative:page;v-text-anchor:top" o:gfxdata="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" o:allowincell="f" filled="f" stroked="f" strokeweight="1pt">
+            <v:shape w14:anchorId="5422BA56" id="Text Box 494" o:spid="_x0000_s1079" type="#_x0000_t202" style="position:absolute;margin-left:614.55pt;margin-top:694.75pt;width:26.85pt;height:12.45pt;z-index:251634176;visibility:visible;mso-wrap-style:square;mso-width-percent:0;mso-height-percent:0;mso-wrap-distance-left:9pt;mso-wrap-distance-top:0;mso-wrap-distance-right:9pt;mso-wrap-distance-bottom:0;mso-position-horizontal:absolute;mso-position-horizontal-relative:text;mso-position-vertical:absolute;mso-position-vertical-relative:text;mso-width-percent:0;mso-height-percent:0;mso-width-relative:page;mso-height-relative:page;v-text-anchor:top" o:gfxdata="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" o:allowincell="f" filled="f" stroked="f" strokeweight="1pt">
               <v:textbox inset="0,0,0,0">
                 <w:txbxContent>
                   <w:p>
@@ -7219,7 +7216,7 @@
         </mc:Choice>
         <mc:Fallback>
           <w:pict>
-            <v:shape w14:anchorId="401E9281" id="Text Box 493" o:spid="_x0000_s1081" type="#_x0000_t202" style="position:absolute;margin-left:593.1pt;margin-top:694.75pt;width:20.75pt;height:12.45pt;z-index:251633152;visibility:visible;mso-wrap-style:square;mso-width-percent:0;mso-height-percent:0;mso-wrap-distance-left:9pt;mso-wrap-distance-top:0;mso-wrap-distance-right:9pt;mso-wrap-distance-bottom:0;mso-position-horizontal:absolute;mso-position-horizontal-relative:text;mso-position-vertical:absolute;mso-position-vertical-relative:text;mso-width-percent:0;mso-height-percent:0;mso-width-relative:page;mso-height-relative:page;v-text-anchor:top" o:gfxdata="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" o:allowincell="f" filled="f" stroked="f" strokeweight="1pt">
+            <v:shape w14:anchorId="401E9281" id="Text Box 493" o:spid="_x0000_s1080" type="#_x0000_t202" style="position:absolute;margin-left:593.1pt;margin-top:694.75pt;width:20.75pt;height:12.45pt;z-index:251633152;visibility:visible;mso-wrap-style:square;mso-width-percent:0;mso-height-percent:0;mso-wrap-distance-left:9pt;mso-wrap-distance-top:0;mso-wrap-distance-right:9pt;mso-wrap-distance-bottom:0;mso-position-horizontal:absolute;mso-position-horizontal-relative:text;mso-position-vertical:absolute;mso-position-vertical-relative:text;mso-width-percent:0;mso-height-percent:0;mso-width-relative:page;mso-height-relative:page;v-text-anchor:top" o:gfxdata="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" o:allowincell="f" filled="f" stroked="f" strokeweight="1pt">
               <v:textbox inset="0,0,0,0">
                 <w:txbxContent>
                   <w:p>
@@ -7313,7 +7310,7 @@
             </wp:anchor>
           </w:drawing>
         </mc:Choice>
-        <mc:Fallback xmlns:a14="http://schemas.microsoft.com/office/drawing/2010/main" xmlns:a="http://schemas.openxmlformats.org/drawingml/2006/main">
+        <mc:Fallback xmlns:a="http://schemas.openxmlformats.org/drawingml/2006/main" xmlns:a14="http://schemas.microsoft.com/office/drawing/2010/main">
           <w:pict>
             <v:line id="Line 491" style="position:absolute;z-index:251631104;visibility:visible;mso-wrap-style:square;mso-width-percent:0;mso-height-percent:0;mso-wrap-distance-left:9pt;mso-wrap-distance-top:0;mso-wrap-distance-right:9pt;mso-wrap-distance-bottom:0;mso-position-horizontal:absolute;mso-position-horizontal-relative:text;mso-position-vertical:absolute;mso-position-vertical-relative:text;mso-width-percent:0;mso-height-percent:0;mso-width-relative:page;mso-height-relative:page" o:spid="_x0000_s1026" o:allowincell="f" strokeweight="1pt" o:gfxdata="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" from="750.1pt,665.15pt" to="750.1pt,779pt" w14:anchorId="3253939E"/>
           </w:pict>
@@ -7386,7 +7383,7 @@
             </wp:anchor>
           </w:drawing>
         </mc:Choice>
-        <mc:Fallback xmlns:a14="http://schemas.microsoft.com/office/drawing/2010/main" xmlns:a="http://schemas.openxmlformats.org/drawingml/2006/main">
+        <mc:Fallback xmlns:a="http://schemas.openxmlformats.org/drawingml/2006/main" xmlns:a14="http://schemas.microsoft.com/office/drawing/2010/main">
           <w:pict>
             <v:line id="Line 489" style="position:absolute;z-index:251629056;visibility:visible;mso-wrap-style:square;mso-width-percent:0;mso-height-percent:0;mso-wrap-distance-left:9pt;mso-wrap-distance-top:0;mso-wrap-distance-right:9pt;mso-wrap-distance-bottom:0;mso-position-horizontal:absolute;mso-position-horizontal-relative:text;mso-position-vertical:absolute;mso-position-vertical-relative:text;mso-width-percent:0;mso-height-percent:0;mso-width-relative:page;mso-height-relative:page" o:spid="_x0000_s1026" o:allowincell="f" strokeweight="1pt" o:gfxdata="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" from="707.55pt,665.15pt" to="707.55pt,779pt" w14:anchorId="1BD6A0E5"/>
           </w:pict>
@@ -7459,7 +7456,7 @@
             </wp:anchor>
           </w:drawing>
         </mc:Choice>
-        <mc:Fallback xmlns:a14="http://schemas.microsoft.com/office/drawing/2010/main" xmlns:a="http://schemas.openxmlformats.org/drawingml/2006/main">
+        <mc:Fallback xmlns:a="http://schemas.openxmlformats.org/drawingml/2006/main" xmlns:a14="http://schemas.microsoft.com/office/drawing/2010/main">
           <w:pict>
             <v:line id="Line 488" style="position:absolute;z-index:251628032;visibility:visible;mso-wrap-style:square;mso-width-percent:0;mso-height-percent:0;mso-wrap-distance-left:9pt;mso-wrap-distance-top:0;mso-wrap-distance-right:9pt;mso-wrap-distance-bottom:0;mso-position-horizontal:absolute;mso-position-horizontal-relative:text;mso-position-vertical:absolute;mso-position-vertical-relative:text;mso-width-percent:0;mso-height-percent:0;mso-width-relative:page;mso-height-relative:page" o:spid="_x0000_s1026" o:allowincell="f" strokeweight="1pt" o:gfxdata="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" from="642.25pt,664.85pt" to="642.25pt,778.7pt" w14:anchorId="3123E541"/>
           </w:pict>
@@ -7532,7 +7529,7 @@
             </wp:anchor>
           </w:drawing>
         </mc:Choice>
-        <mc:Fallback xmlns:a14="http://schemas.microsoft.com/office/drawing/2010/main" xmlns:a="http://schemas.openxmlformats.org/drawingml/2006/main">
+        <mc:Fallback xmlns:a="http://schemas.openxmlformats.org/drawingml/2006/main" xmlns:a14="http://schemas.microsoft.com/office/drawing/2010/main">
           <w:pict>
             <v:line id="Line 487" style="position:absolute;z-index:251627008;visibility:visible;mso-wrap-style:square;mso-width-percent:0;mso-height-percent:0;mso-wrap-distance-left:9pt;mso-wrap-distance-top:0;mso-wrap-distance-right:9pt;mso-wrap-distance-bottom:0;mso-position-horizontal:absolute;mso-position-horizontal-relative:text;mso-position-vertical:absolute;mso-position-vertical-relative:text;mso-width-percent:0;mso-height-percent:0;mso-width-relative:page;mso-height-relative:page" o:spid="_x0000_s1026" o:allowincell="f" strokeweight="1pt" o:gfxdata="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" from="613.85pt,665.15pt" to="613.85pt,707.75pt" w14:anchorId="46A79DD4"/>
           </w:pict>
@@ -7605,7 +7602,7 @@
             </wp:anchor>
           </w:drawing>
         </mc:Choice>
-        <mc:Fallback xmlns:a14="http://schemas.microsoft.com/office/drawing/2010/main" xmlns:a="http://schemas.openxmlformats.org/drawingml/2006/main">
+        <mc:Fallback xmlns:a="http://schemas.openxmlformats.org/drawingml/2006/main" xmlns:a14="http://schemas.microsoft.com/office/drawing/2010/main">
           <w:pict>
             <v:line id="Line 484" style="position:absolute;z-index:251623936;visibility:visible;mso-wrap-style:square;mso-width-percent:0;mso-height-percent:0;mso-wrap-distance-left:9pt;mso-wrap-distance-top:0;mso-wrap-distance-right:9pt;mso-wrap-distance-bottom:0;mso-position-horizontal:absolute;mso-position-horizontal-relative:text;mso-position-vertical:absolute;mso-position-vertical-relative:text;mso-width-percent:0;mso-height-percent:0;mso-width-relative:page;mso-height-relative:page" o:spid="_x0000_s1026" o:allowincell="f" strokeweight="1pt" o:gfxdata="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" from="977.45pt,706.75pt" to="977.45pt,778.9pt" w14:anchorId="65D48399"/>
           </w:pict>
@@ -7689,7 +7686,7 @@
         </mc:Choice>
         <mc:Fallback>
           <w:pict>
-            <v:rect w14:anchorId="4FA9416D" id="Rectangle 483" o:spid="_x0000_s1082" style="position:absolute;margin-left:779.65pt;margin-top:706.75pt;width:339.95pt;height:71.6pt;z-index:251622912;visibility:visible;mso-wrap-style:square;mso-width-percent:0;mso-height-percent:0;mso-wrap-distance-left:9pt;mso-wrap-distance-top:0;mso-wrap-distance-right:9pt;mso-wrap-distance-bottom:0;mso-position-horizontal:absolute;mso-position-horizontal-relative:text;mso-position-vertical:absolute;mso-position-vertical-relative:text;mso-width-percent:0;mso-height-percent:0;mso-width-relative:page;mso-height-relative:page;v-text-anchor:top" o:gfxdata="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" o:allowincell="f" filled="f" strokeweight="1pt">
+            <v:rect w14:anchorId="4FA9416D" id="Rectangle 483" o:spid="_x0000_s1081" style="position:absolute;margin-left:779.65pt;margin-top:706.75pt;width:339.95pt;height:71.6pt;z-index:251622912;visibility:visible;mso-wrap-style:square;mso-width-percent:0;mso-height-percent:0;mso-wrap-distance-left:9pt;mso-wrap-distance-top:0;mso-wrap-distance-right:9pt;mso-wrap-distance-bottom:0;mso-position-horizontal:absolute;mso-position-horizontal-relative:text;mso-position-vertical:absolute;mso-position-vertical-relative:text;mso-width-percent:0;mso-height-percent:0;mso-width-relative:page;mso-height-relative:page;v-text-anchor:top" o:gfxdata="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" o:allowincell="f" filled="f" strokeweight="1pt">
               <v:textbox inset="0,0,0,0">
                 <w:txbxContent>
                   <w:p/>
@@ -7763,7 +7760,7 @@
             </wp:anchor>
           </w:drawing>
         </mc:Choice>
-        <mc:Fallback xmlns:a14="http://schemas.microsoft.com/office/drawing/2010/main" xmlns:a="http://schemas.openxmlformats.org/drawingml/2006/main">
+        <mc:Fallback xmlns:a="http://schemas.openxmlformats.org/drawingml/2006/main" xmlns:a14="http://schemas.microsoft.com/office/drawing/2010/main">
           <w:pict>
             <v:rect id="Rectangle 482" style="position:absolute;margin-left:593.05pt;margin-top:764.15pt;width:186.5pt;height:14.35pt;z-index:251621888;visibility:visible;mso-wrap-style:square;mso-width-percent:0;mso-height-percent:0;mso-wrap-distance-left:9pt;mso-wrap-distance-top:0;mso-wrap-distance-right:9pt;mso-wrap-distance-bottom:0;mso-position-horizontal:absolute;mso-position-horizontal-relative:text;mso-position-vertical:absolute;mso-position-vertical-relative:text;mso-width-percent:0;mso-height-percent:0;mso-width-relative:page;mso-height-relative:page;v-text-anchor:top" o:spid="_x0000_s1026" o:allowincell="f" strokeweight="1pt" o:gfxdata="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" w14:anchorId="0B43219B"/>
           </w:pict>
@@ -7833,7 +7830,7 @@
             </wp:anchor>
           </w:drawing>
         </mc:Choice>
-        <mc:Fallback xmlns:a14="http://schemas.microsoft.com/office/drawing/2010/main" xmlns:a="http://schemas.openxmlformats.org/drawingml/2006/main">
+        <mc:Fallback xmlns:a="http://schemas.openxmlformats.org/drawingml/2006/main" xmlns:a14="http://schemas.microsoft.com/office/drawing/2010/main">
           <w:pict>
             <v:rect id="Rectangle 481" style="position:absolute;margin-left:593.15pt;margin-top:750.15pt;width:186.5pt;height:14.3pt;z-index:251620864;visibility:visible;mso-wrap-style:square;mso-width-percent:0;mso-height-percent:0;mso-wrap-distance-left:9pt;mso-wrap-distance-top:0;mso-wrap-distance-right:9pt;mso-wrap-distance-bottom:0;mso-position-horizontal:absolute;mso-position-horizontal-relative:text;mso-position-vertical:absolute;mso-position-vertical-relative:text;mso-width-percent:0;mso-height-percent:0;mso-width-relative:page;mso-height-relative:page;v-text-anchor:top" o:spid="_x0000_s1026" o:allowincell="f" strokeweight="1pt" o:gfxdata="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" w14:anchorId="2B80147A"/>
           </w:pict>
@@ -7903,7 +7900,7 @@
             </wp:anchor>
           </w:drawing>
         </mc:Choice>
-        <mc:Fallback xmlns:a14="http://schemas.microsoft.com/office/drawing/2010/main" xmlns:a="http://schemas.openxmlformats.org/drawingml/2006/main">
+        <mc:Fallback xmlns:a="http://schemas.openxmlformats.org/drawingml/2006/main" xmlns:a14="http://schemas.microsoft.com/office/drawing/2010/main">
           <w:pict>
             <v:rect id="Rectangle 480" style="position:absolute;margin-left:593.05pt;margin-top:735.9pt;width:186.6pt;height:14.25pt;z-index:251619840;visibility:visible;mso-wrap-style:square;mso-width-percent:0;mso-height-percent:0;mso-wrap-distance-left:9pt;mso-wrap-distance-top:0;mso-wrap-distance-right:9pt;mso-wrap-distance-bottom:0;mso-position-horizontal:absolute;mso-position-horizontal-relative:text;mso-position-vertical:absolute;mso-position-vertical-relative:text;mso-width-percent:0;mso-height-percent:0;mso-width-relative:page;mso-height-relative:page;v-text-anchor:top" o:spid="_x0000_s1026" o:allowincell="f" strokeweight="1pt" o:gfxdata="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" w14:anchorId="4D216909"/>
           </w:pict>
@@ -7973,7 +7970,7 @@
             </wp:anchor>
           </w:drawing>
         </mc:Choice>
-        <mc:Fallback xmlns:a14="http://schemas.microsoft.com/office/drawing/2010/main" xmlns:a="http://schemas.openxmlformats.org/drawingml/2006/main">
+        <mc:Fallback xmlns:a="http://schemas.openxmlformats.org/drawingml/2006/main" xmlns:a14="http://schemas.microsoft.com/office/drawing/2010/main">
           <w:pict>
             <v:rect id="Rectangle 479" style="position:absolute;margin-left:593.15pt;margin-top:720.55pt;width:186.6pt;height:15.55pt;z-index:251618816;visibility:visible;mso-wrap-style:square;mso-width-percent:0;mso-height-percent:0;mso-wrap-distance-left:9pt;mso-wrap-distance-top:0;mso-wrap-distance-right:9pt;mso-wrap-distance-bottom:0;mso-position-horizontal:absolute;mso-position-horizontal-relative:text;mso-position-vertical:absolute;mso-position-vertical-relative:text;mso-width-percent:0;mso-height-percent:0;mso-width-relative:page;mso-height-relative:page;v-text-anchor:top" o:spid="_x0000_s1026" o:allowincell="f" strokeweight="1pt" o:gfxdata="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" w14:anchorId="08CDC87F"/>
           </w:pict>
@@ -8043,7 +8040,7 @@
             </wp:anchor>
           </w:drawing>
         </mc:Choice>
-        <mc:Fallback xmlns:a14="http://schemas.microsoft.com/office/drawing/2010/main" xmlns:a="http://schemas.openxmlformats.org/drawingml/2006/main">
+        <mc:Fallback xmlns:a="http://schemas.openxmlformats.org/drawingml/2006/main" xmlns:a14="http://schemas.microsoft.com/office/drawing/2010/main">
           <w:pict>
             <v:rect id="Rectangle 478" style="position:absolute;margin-left:593.05pt;margin-top:707.25pt;width:186.7pt;height:14.7pt;z-index:251617792;visibility:visible;mso-wrap-style:square;mso-width-percent:0;mso-height-percent:0;mso-wrap-distance-left:9pt;mso-wrap-distance-top:0;mso-wrap-distance-right:9pt;mso-wrap-distance-bottom:0;mso-position-horizontal:absolute;mso-position-horizontal-relative:text;mso-position-vertical:absolute;mso-position-vertical-relative:text;mso-width-percent:0;mso-height-percent:0;mso-width-relative:page;mso-height-relative:page;v-text-anchor:top" o:spid="_x0000_s1026" o:allowincell="f" strokeweight="1pt" o:gfxdata="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" w14:anchorId="0882226C"/>
           </w:pict>
@@ -8113,7 +8110,7 @@
             </wp:anchor>
           </w:drawing>
         </mc:Choice>
-        <mc:Fallback xmlns:a14="http://schemas.microsoft.com/office/drawing/2010/main" xmlns:a="http://schemas.openxmlformats.org/drawingml/2006/main">
+        <mc:Fallback xmlns:a="http://schemas.openxmlformats.org/drawingml/2006/main" xmlns:a14="http://schemas.microsoft.com/office/drawing/2010/main">
           <w:pict>
             <v:rect id="Rectangle 477" style="position:absolute;margin-left:593.05pt;margin-top:693.3pt;width:186.7pt;height:14.55pt;z-index:251616768;visibility:visible;mso-wrap-style:square;mso-width-percent:0;mso-height-percent:0;mso-wrap-distance-left:9pt;mso-wrap-distance-top:0;mso-wrap-distance-right:9pt;mso-wrap-distance-bottom:0;mso-position-horizontal:absolute;mso-position-horizontal-relative:text;mso-position-vertical:absolute;mso-position-vertical-relative:text;mso-width-percent:0;mso-height-percent:0;mso-width-relative:page;mso-height-relative:page;v-text-anchor:top" o:spid="_x0000_s1026" o:allowincell="f" strokeweight="1pt" o:gfxdata="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" w14:anchorId="50E75FDA"/>
           </w:pict>
@@ -8183,7 +8180,7 @@
             </wp:anchor>
           </w:drawing>
         </mc:Choice>
-        <mc:Fallback xmlns:a14="http://schemas.microsoft.com/office/drawing/2010/main" xmlns:a="http://schemas.openxmlformats.org/drawingml/2006/main">
+        <mc:Fallback xmlns:a="http://schemas.openxmlformats.org/drawingml/2006/main" xmlns:a14="http://schemas.microsoft.com/office/drawing/2010/main">
           <w:pict>
             <v:rect id="Rectangle 476" style="position:absolute;margin-left:593.15pt;margin-top:679.05pt;width:186.75pt;height:14.15pt;z-index:251615744;visibility:visible;mso-wrap-style:square;mso-width-percent:0;mso-height-percent:0;mso-wrap-distance-left:9pt;mso-wrap-distance-top:0;mso-wrap-distance-right:9pt;mso-wrap-distance-bottom:0;mso-position-horizontal:absolute;mso-position-horizontal-relative:text;mso-position-vertical:absolute;mso-position-vertical-relative:text;mso-width-percent:0;mso-height-percent:0;mso-width-relative:page;mso-height-relative:page;v-text-anchor:top" o:spid="_x0000_s1026" o:allowincell="f" strokeweight="1pt" o:gfxdata="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" w14:anchorId="4416D980"/>
           </w:pict>
@@ -8253,7 +8250,7 @@
             </wp:anchor>
           </w:drawing>
         </mc:Choice>
-        <mc:Fallback xmlns:a14="http://schemas.microsoft.com/office/drawing/2010/main" xmlns:a="http://schemas.openxmlformats.org/drawingml/2006/main">
+        <mc:Fallback xmlns:a="http://schemas.openxmlformats.org/drawingml/2006/main" xmlns:a14="http://schemas.microsoft.com/office/drawing/2010/main">
           <w:pict>
             <v:rect id="Rectangle 475" style="position:absolute;margin-left:593.15pt;margin-top:664.85pt;width:186.75pt;height:14.1pt;z-index:251614720;visibility:visible;mso-wrap-style:square;mso-width-percent:0;mso-height-percent:0;mso-wrap-distance-left:9pt;mso-wrap-distance-top:0;mso-wrap-distance-right:9pt;mso-wrap-distance-bottom:0;mso-position-horizontal:absolute;mso-position-horizontal-relative:text;mso-position-vertical:absolute;mso-position-vertical-relative:text;mso-width-percent:0;mso-height-percent:0;mso-width-relative:page;mso-height-relative:page;v-text-anchor:top" o:spid="_x0000_s1026" o:allowincell="f" strokeweight="1pt" o:gfxdata="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" w14:anchorId="53C0B500"/>
           </w:pict>
@@ -8354,7 +8351,7 @@
         </mc:Choice>
         <mc:Fallback>
           <w:pict>
-            <v:shape w14:anchorId="740639C7" id="Text Box 474" o:spid="_x0000_s1083" type="#_x0000_t202" style="position:absolute;margin-left:-.9pt;margin-top:779.6pt;width:197.2pt;height:12.55pt;z-index:251613696;visibility:visible;mso-wrap-style:square;mso-width-percent:0;mso-height-percent:0;mso-wrap-distance-left:9pt;mso-wrap-distance-top:0;mso-wrap-distance-right:9pt;mso-wrap-distance-bottom:0;mso-position-horizontal:absolute;mso-position-horizontal-relative:text;mso-position-vertical:absolute;mso-position-vertical-relative:text;mso-width-percent:0;mso-height-percent:0;mso-width-relative:page;mso-height-relative:page;v-text-anchor:top" o:gfxdata="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" o:allowincell="f" filled="f" stroked="f" strokeweight="1pt">
+            <v:shape w14:anchorId="740639C7" id="Text Box 474" o:spid="_x0000_s1082" type="#_x0000_t202" style="position:absolute;margin-left:-.9pt;margin-top:779.6pt;width:197.2pt;height:12.55pt;z-index:251613696;visibility:visible;mso-wrap-style:square;mso-width-percent:0;mso-height-percent:0;mso-wrap-distance-left:9pt;mso-wrap-distance-top:0;mso-wrap-distance-right:9pt;mso-wrap-distance-bottom:0;mso-position-horizontal:absolute;mso-position-horizontal-relative:text;mso-position-vertical:absolute;mso-position-vertical-relative:text;mso-width-percent:0;mso-height-percent:0;mso-width-relative:page;mso-height-relative:page;v-text-anchor:top" o:gfxdata="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" o:allowincell="f" filled="f" stroked="f" strokeweight="1pt">
               <v:textbox inset="0,0,0,0">
                 <w:txbxContent>
                   <w:p>
@@ -8472,7 +8469,7 @@
         </mc:Choice>
         <mc:Fallback>
           <w:pict>
-            <v:shape w14:anchorId="097F0B2B" id="Text Box 473" o:spid="_x0000_s1084" type="#_x0000_t202" style="position:absolute;margin-left:977.85pt;margin-top:779.6pt;width:140.5pt;height:12.5pt;z-index:251612672;visibility:visible;mso-wrap-style:square;mso-width-percent:0;mso-height-percent:0;mso-wrap-distance-left:9pt;mso-wrap-distance-top:0;mso-wrap-distance-right:9pt;mso-wrap-distance-bottom:0;mso-position-horizontal:absolute;mso-position-horizontal-relative:text;mso-position-vertical:absolute;mso-position-vertical-relative:text;mso-width-percent:0;mso-height-percent:0;mso-width-relative:page;mso-height-relative:page;v-text-anchor:top" o:gfxdata="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" o:allowincell="f" filled="f" stroked="f" strokeweight="1pt">
+            <v:shape w14:anchorId="097F0B2B" id="Text Box 473" o:spid="_x0000_s1083" type="#_x0000_t202" style="position:absolute;margin-left:977.85pt;margin-top:779.6pt;width:140.5pt;height:12.5pt;z-index:251612672;visibility:visible;mso-wrap-style:square;mso-width-percent:0;mso-height-percent:0;mso-wrap-distance-left:9pt;mso-wrap-distance-top:0;mso-wrap-distance-right:9pt;mso-wrap-distance-bottom:0;mso-position-horizontal:absolute;mso-position-horizontal-relative:text;mso-position-vertical:absolute;mso-position-vertical-relative:text;mso-width-percent:0;mso-height-percent:0;mso-width-relative:page;mso-height-relative:page;v-text-anchor:top" o:gfxdata="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" o:allowincell="f" filled="f" stroked="f" strokeweight="1pt">
               <v:textbox inset="0,0,0,0">
                 <w:txbxContent>
                   <w:p>
@@ -8562,7 +8559,7 @@
             </wp:anchor>
           </w:drawing>
         </mc:Choice>
-        <mc:Fallback xmlns:a14="http://schemas.microsoft.com/office/drawing/2010/main" xmlns:a="http://schemas.openxmlformats.org/drawingml/2006/main">
+        <mc:Fallback xmlns:a="http://schemas.openxmlformats.org/drawingml/2006/main" xmlns:a14="http://schemas.microsoft.com/office/drawing/2010/main">
           <w:pict>
             <v:line id="Line 472" style="position:absolute;z-index:251611648;visibility:visible;mso-wrap-style:square;mso-width-percent:0;mso-height-percent:0;mso-wrap-distance-left:9pt;mso-wrap-distance-top:0;mso-wrap-distance-right:9pt;mso-wrap-distance-bottom:0;mso-position-horizontal:absolute;mso-position-horizontal-relative:text;mso-position-vertical:absolute;mso-position-vertical-relative:text;mso-width-percent:0;mso-height-percent:0;mso-width-relative:page;mso-height-relative:page" o:spid="_x0000_s1026" o:allowincell="f" strokeweight="1pt" o:gfxdata="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" from="-36.4pt,609.85pt" to="0,609.85pt" w14:anchorId="79671B71"/>
           </w:pict>
@@ -8664,7 +8661,7 @@
         </mc:Choice>
         <mc:Fallback>
           <w:pict>
-            <v:shape w14:anchorId="183724A5" id="Text Box 471" o:spid="_x0000_s1085" type="#_x0000_t202" style="position:absolute;margin-left:-36.5pt;margin-top:367.7pt;width:14.15pt;height:102.05pt;z-index:251610624;visibility:visible;mso-wrap-style:square;mso-width-percent:0;mso-height-percent:0;mso-wrap-distance-left:9pt;mso-wrap-distance-top:0;mso-wrap-distance-right:9pt;mso-wrap-distance-bottom:0;mso-position-horizontal:absolute;mso-position-horizontal-relative:text;mso-position-vertical:absolute;mso-position-vertical-relative:text;mso-width-percent:0;mso-height-percent:0;mso-width-relative:page;mso-height-relative:page;v-text-anchor:top" o:gfxdata="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" o:allowincell="f" filled="f" stroked="f" strokeweight="1pt">
+            <v:shape w14:anchorId="183724A5" id="Text Box 471" o:spid="_x0000_s1084" type="#_x0000_t202" style="position:absolute;margin-left:-36.5pt;margin-top:367.7pt;width:14.15pt;height:102.05pt;z-index:251610624;visibility:visible;mso-wrap-style:square;mso-width-percent:0;mso-height-percent:0;mso-wrap-distance-left:9pt;mso-wrap-distance-top:0;mso-wrap-distance-right:9pt;mso-wrap-distance-bottom:0;mso-position-horizontal:absolute;mso-position-horizontal-relative:text;mso-position-vertical:absolute;mso-position-vertical-relative:text;mso-width-percent:0;mso-height-percent:0;mso-width-relative:page;mso-height-relative:page;v-text-anchor:top" o:gfxdata="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" o:allowincell="f" filled="f" stroked="f" strokeweight="1pt">
               <v:textbox style="layout-flow:vertical;mso-layout-flow-alt:bottom-to-top" inset="0,0,0,0">
                 <w:txbxContent>
                   <w:p>
@@ -8797,7 +8794,7 @@
         </mc:Choice>
         <mc:Fallback>
           <w:pict>
-            <v:shape w14:anchorId="1BDF4ABE" id="Text Box 470" o:spid="_x0000_s1086" type="#_x0000_t202" style="position:absolute;margin-left:-36.55pt;margin-top:469.1pt;width:14.9pt;height:70.6pt;z-index:251609600;visibility:visible;mso-wrap-style:square;mso-width-percent:0;mso-height-percent:0;mso-wrap-distance-left:9pt;mso-wrap-distance-top:0;mso-wrap-distance-right:9pt;mso-wrap-distance-bottom:0;mso-position-horizontal:absolute;mso-position-horizontal-relative:text;mso-position-vertical:absolute;mso-position-vertical-relative:text;mso-width-percent:0;mso-height-percent:0;mso-width-relative:page;mso-height-relative:page;v-text-anchor:top" o:gfxdata="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" o:allowincell="f" filled="f" stroked="f" strokeweight="1pt">
+            <v:shape w14:anchorId="1BDF4ABE" id="Text Box 470" o:spid="_x0000_s1085" type="#_x0000_t202" style="position:absolute;margin-left:-36.55pt;margin-top:469.1pt;width:14.9pt;height:70.6pt;z-index:251609600;visibility:visible;mso-wrap-style:square;mso-width-percent:0;mso-height-percent:0;mso-wrap-distance-left:9pt;mso-wrap-distance-top:0;mso-wrap-distance-right:9pt;mso-wrap-distance-bottom:0;mso-position-horizontal:absolute;mso-position-horizontal-relative:text;mso-position-vertical:absolute;mso-position-vertical-relative:text;mso-width-percent:0;mso-height-percent:0;mso-width-relative:page;mso-height-relative:page;v-text-anchor:top" o:gfxdata="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" o:allowincell="f" filled="f" stroked="f" strokeweight="1pt">
               <v:textbox style="layout-flow:vertical;mso-layout-flow-alt:bottom-to-top" inset="0,0,0,0">
                 <w:txbxContent>
                   <w:p>
@@ -8938,7 +8935,7 @@
         </mc:Choice>
         <mc:Fallback>
           <w:pict>
-            <v:shape w14:anchorId="09985EC4" id="Text Box 469" o:spid="_x0000_s1087" type="#_x0000_t202" style="position:absolute;margin-left:-36.55pt;margin-top:541.35pt;width:14.55pt;height:67.5pt;z-index:251608576;visibility:visible;mso-wrap-style:square;mso-width-percent:0;mso-height-percent:0;mso-wrap-distance-left:9pt;mso-wrap-distance-top:0;mso-wrap-distance-right:9pt;mso-wrap-distance-bottom:0;mso-position-horizontal:absolute;mso-position-horizontal-relative:text;mso-position-vertical:absolute;mso-position-vertical-relative:text;mso-width-percent:0;mso-height-percent:0;mso-width-relative:page;mso-height-relative:page;v-text-anchor:top" o:gfxdata="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" o:allowincell="f" filled="f" stroked="f" strokeweight="1pt">
+            <v:shape w14:anchorId="09985EC4" id="Text Box 469" o:spid="_x0000_s1086" type="#_x0000_t202" style="position:absolute;margin-left:-36.55pt;margin-top:541.35pt;width:14.55pt;height:67.5pt;z-index:251608576;visibility:visible;mso-wrap-style:square;mso-width-percent:0;mso-height-percent:0;mso-wrap-distance-left:9pt;mso-wrap-distance-top:0;mso-wrap-distance-right:9pt;mso-wrap-distance-bottom:0;mso-position-horizontal:absolute;mso-position-horizontal-relative:text;mso-position-vertical:absolute;mso-position-vertical-relative:text;mso-width-percent:0;mso-height-percent:0;mso-width-relative:page;mso-height-relative:page;v-text-anchor:top" o:gfxdata="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" o:allowincell="f" filled="f" stroked="f" strokeweight="1pt">
               <v:textbox style="layout-flow:vertical;mso-layout-flow-alt:bottom-to-top" inset="0,0,0,0">
                 <w:txbxContent>
                   <w:p>
@@ -9065,7 +9062,7 @@
         </mc:Choice>
         <mc:Fallback>
           <w:pict>
-            <v:shape w14:anchorId="634538CD" id="Text Box 468" o:spid="_x0000_s1088" type="#_x0000_t202" style="position:absolute;margin-left:-36.55pt;margin-top:609.55pt;width:14.55pt;height:97.55pt;z-index:251607552;visibility:visible;mso-wrap-style:square;mso-width-percent:0;mso-height-percent:0;mso-wrap-distance-left:9pt;mso-wrap-distance-top:0;mso-wrap-distance-right:9pt;mso-wrap-distance-bottom:0;mso-position-horizontal:absolute;mso-position-horizontal-relative:text;mso-position-vertical:absolute;mso-position-vertical-relative:text;mso-width-percent:0;mso-height-percent:0;mso-width-relative:page;mso-height-relative:page;v-text-anchor:top" o:gfxdata="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" o:allowincell="f" filled="f" stroked="f" strokeweight="1pt">
+            <v:shape w14:anchorId="634538CD" id="Text Box 468" o:spid="_x0000_s1087" type="#_x0000_t202" style="position:absolute;margin-left:-36.55pt;margin-top:609.55pt;width:14.55pt;height:97.55pt;z-index:251607552;visibility:visible;mso-wrap-style:square;mso-width-percent:0;mso-height-percent:0;mso-wrap-distance-left:9pt;mso-wrap-distance-top:0;mso-wrap-distance-right:9pt;mso-wrap-distance-bottom:0;mso-position-horizontal:absolute;mso-position-horizontal-relative:text;mso-position-vertical:absolute;mso-position-vertical-relative:text;mso-width-percent:0;mso-height-percent:0;mso-width-relative:page;mso-height-relative:page;v-text-anchor:top" o:gfxdata="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" o:allowincell="f" filled="f" stroked="f" strokeweight="1pt">
               <v:textbox style="layout-flow:vertical;mso-layout-flow-alt:bottom-to-top" inset="0,0,0,0">
                 <w:txbxContent>
                   <w:p>
@@ -9184,7 +9181,7 @@
         </mc:Choice>
         <mc:Fallback>
           <w:pict>
-            <v:shape w14:anchorId="4563AF92" id="Text Box 467" o:spid="_x0000_s1089" type="#_x0000_t202" style="position:absolute;margin-left:-36.15pt;margin-top:707.55pt;width:14.95pt;height:71.35pt;z-index:251606528;visibility:visible;mso-wrap-style:square;mso-width-percent:0;mso-height-percent:0;mso-wrap-distance-left:9pt;mso-wrap-distance-top:0;mso-wrap-distance-right:9pt;mso-wrap-distance-bottom:0;mso-position-horizontal:absolute;mso-position-horizontal-relative:text;mso-position-vertical:absolute;mso-position-vertical-relative:text;mso-width-percent:0;mso-height-percent:0;mso-width-relative:page;mso-height-relative:page;v-text-anchor:top" o:gfxdata="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" o:allowincell="f" filled="f" stroked="f" strokeweight="1pt">
+            <v:shape w14:anchorId="4563AF92" id="Text Box 467" o:spid="_x0000_s1088" type="#_x0000_t202" style="position:absolute;margin-left:-36.15pt;margin-top:707.55pt;width:14.95pt;height:71.35pt;z-index:251606528;visibility:visible;mso-wrap-style:square;mso-width-percent:0;mso-height-percent:0;mso-wrap-distance-left:9pt;mso-wrap-distance-top:0;mso-wrap-distance-right:9pt;mso-wrap-distance-bottom:0;mso-position-horizontal:absolute;mso-position-horizontal-relative:text;mso-position-vertical:absolute;mso-position-vertical-relative:text;mso-width-percent:0;mso-height-percent:0;mso-width-relative:page;mso-height-relative:page;v-text-anchor:top" o:gfxdata="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" o:allowincell="f" filled="f" stroked="f" strokeweight="1pt">
               <v:textbox style="layout-flow:vertical;mso-layout-flow-alt:bottom-to-top" inset="0,0,0,0">
                 <w:txbxContent>
                   <w:p>
@@ -9274,7 +9271,7 @@
             </wp:anchor>
           </w:drawing>
         </mc:Choice>
-        <mc:Fallback xmlns:a14="http://schemas.microsoft.com/office/drawing/2010/main" xmlns:a="http://schemas.openxmlformats.org/drawingml/2006/main">
+        <mc:Fallback xmlns:a="http://schemas.openxmlformats.org/drawingml/2006/main" xmlns:a14="http://schemas.microsoft.com/office/drawing/2010/main">
           <w:pict>
             <v:line id="Line 466" style="position:absolute;z-index:251605504;visibility:visible;mso-wrap-style:square;mso-width-percent:0;mso-height-percent:0;mso-wrap-distance-left:9pt;mso-wrap-distance-top:0;mso-wrap-distance-right:9pt;mso-wrap-distance-bottom:0;mso-position-horizontal:absolute;mso-position-horizontal-relative:text;mso-position-vertical:absolute;mso-position-vertical-relative:text;mso-width-percent:0;mso-height-percent:0;mso-width-relative:page;mso-height-relative:page" o:spid="_x0000_s1026" o:allowincell="f" strokeweight="1pt" o:gfxdata="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" from="-36.2pt,707.7pt" to="-1.2pt,707.7pt" w14:anchorId="3CECCB03"/>
           </w:pict>
@@ -9347,7 +9344,7 @@
             </wp:anchor>
           </w:drawing>
         </mc:Choice>
-        <mc:Fallback xmlns:a14="http://schemas.microsoft.com/office/drawing/2010/main" xmlns:a="http://schemas.openxmlformats.org/drawingml/2006/main">
+        <mc:Fallback xmlns:a="http://schemas.openxmlformats.org/drawingml/2006/main" xmlns:a14="http://schemas.microsoft.com/office/drawing/2010/main">
           <w:pict>
             <v:line id="Line 465" style="position:absolute;z-index:251604480;visibility:visible;mso-wrap-style:square;mso-width-percent:0;mso-height-percent:0;mso-wrap-distance-left:9pt;mso-wrap-distance-top:0;mso-wrap-distance-right:9pt;mso-wrap-distance-bottom:0;mso-position-horizontal:absolute;mso-position-horizontal-relative:text;mso-position-vertical:absolute;mso-position-vertical-relative:text;mso-width-percent:0;mso-height-percent:0;mso-width-relative:page;mso-height-relative:page" o:spid="_x0000_s1026" o:allowincell="f" strokeweight="1pt" o:gfxdata="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" from="-34.8pt,609.85pt" to="-.65pt,609.85pt" w14:anchorId="31A4C409"/>
           </w:pict>
@@ -9420,7 +9417,7 @@
             </wp:anchor>
           </w:drawing>
         </mc:Choice>
-        <mc:Fallback xmlns:a14="http://schemas.microsoft.com/office/drawing/2010/main" xmlns:a="http://schemas.openxmlformats.org/drawingml/2006/main">
+        <mc:Fallback xmlns:a="http://schemas.openxmlformats.org/drawingml/2006/main" xmlns:a14="http://schemas.microsoft.com/office/drawing/2010/main">
           <w:pict>
             <v:line id="Line 464" style="position:absolute;z-index:251603456;visibility:visible;mso-wrap-style:square;mso-width-percent:0;mso-height-percent:0;mso-wrap-distance-left:9pt;mso-wrap-distance-top:0;mso-wrap-distance-right:9pt;mso-wrap-distance-bottom:0;mso-position-horizontal:absolute;mso-position-horizontal-relative:text;mso-position-vertical:absolute;mso-position-vertical-relative:text;mso-width-percent:0;mso-height-percent:0;mso-width-relative:page;mso-height-relative:page" o:spid="_x0000_s1026" o:allowincell="f" strokeweight="1pt" o:gfxdata="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" from="-36.4pt,540.35pt" to="-.3pt,540.35pt" w14:anchorId="135168D1"/>
           </w:pict>
@@ -9493,7 +9490,7 @@
             </wp:anchor>
           </w:drawing>
         </mc:Choice>
-        <mc:Fallback xmlns:a14="http://schemas.microsoft.com/office/drawing/2010/main" xmlns:a="http://schemas.openxmlformats.org/drawingml/2006/main">
+        <mc:Fallback xmlns:a="http://schemas.openxmlformats.org/drawingml/2006/main" xmlns:a14="http://schemas.microsoft.com/office/drawing/2010/main">
           <w:pict>
             <v:line id="Line 463" style="position:absolute;flip:y;z-index:251602432;visibility:visible;mso-wrap-style:square;mso-width-percent:0;mso-height-percent:0;mso-wrap-distance-left:9pt;mso-wrap-distance-top:0;mso-wrap-distance-right:9pt;mso-wrap-distance-bottom:0;mso-position-horizontal:absolute;mso-position-horizontal-relative:text;mso-position-vertical:absolute;mso-position-vertical-relative:text;mso-width-percent:0;mso-height-percent:0;mso-width-relative:page;mso-height-relative:page" o:spid="_x0000_s1026" o:allowincell="f" strokeweight="1pt" o:gfxdata="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" from="-22pt,366.55pt" to="-22pt,778.4pt" w14:anchorId="7B3CDED4"/>
           </w:pict>
@@ -9566,7 +9563,7 @@
             </wp:anchor>
           </w:drawing>
         </mc:Choice>
-        <mc:Fallback xmlns:a14="http://schemas.microsoft.com/office/drawing/2010/main" xmlns:a="http://schemas.openxmlformats.org/drawingml/2006/main">
+        <mc:Fallback xmlns:a="http://schemas.openxmlformats.org/drawingml/2006/main" xmlns:a14="http://schemas.microsoft.com/office/drawing/2010/main">
           <w:pict>
             <v:line id="Line 462" style="position:absolute;z-index:251601408;visibility:visible;mso-wrap-style:square;mso-width-percent:0;mso-height-percent:0;mso-wrap-distance-left:9pt;mso-wrap-distance-top:0;mso-wrap-distance-right:9pt;mso-wrap-distance-bottom:0;mso-position-horizontal:absolute;mso-position-horizontal-relative:text;mso-position-vertical:absolute;mso-position-vertical-relative:text;mso-width-percent:0;mso-height-percent:0;mso-width-relative:page;mso-height-relative:page" o:spid="_x0000_s1026" o:allowincell="f" strokeweight="1pt" o:gfxdata="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" from="-35.5pt,469.6pt" to="-1.25pt,469.6pt" w14:anchorId="751467B4"/>
           </w:pict>
@@ -9636,7 +9633,7 @@
             </wp:anchor>
           </w:drawing>
         </mc:Choice>
-        <mc:Fallback xmlns:a14="http://schemas.microsoft.com/office/drawing/2010/main" xmlns:a="http://schemas.openxmlformats.org/drawingml/2006/main">
+        <mc:Fallback xmlns:a="http://schemas.openxmlformats.org/drawingml/2006/main" xmlns:a14="http://schemas.microsoft.com/office/drawing/2010/main">
           <w:pict>
             <v:rect id="Rectangle 461" style="position:absolute;margin-left:-35.7pt;margin-top:366.9pt;width:34.95pt;height:411.5pt;z-index:251600384;visibility:visible;mso-wrap-style:square;mso-width-percent:0;mso-height-percent:0;mso-wrap-distance-left:9pt;mso-wrap-distance-top:0;mso-wrap-distance-right:9pt;mso-wrap-distance-bottom:0;mso-position-horizontal:absolute;mso-position-horizontal-relative:text;mso-position-vertical:absolute;mso-position-vertical-relative:text;mso-width-percent:0;mso-height-percent:0;mso-width-relative:page;mso-height-relative:page;v-text-anchor:top" o:spid="_x0000_s1026" o:allowincell="f" strokeweight="1pt" o:gfxdata="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" w14:anchorId="4698E487">
               <v:textbox inset="0,0,0,0"/>
@@ -9715,7 +9712,7 @@
             </wp:anchor>
           </w:drawing>
         </mc:Choice>
-        <mc:Fallback xmlns:a14="http://schemas.microsoft.com/office/drawing/2010/main" xmlns:a="http://schemas.openxmlformats.org/drawingml/2006/main">
+        <mc:Fallback xmlns:a="http://schemas.openxmlformats.org/drawingml/2006/main" xmlns:a14="http://schemas.microsoft.com/office/drawing/2010/main">
           <w:pict>
             <v:rect id="Rectangle 460" style="position:absolute;margin-left:-.3pt;margin-top:-18.1pt;width:1119.85pt;height:796.3pt;z-index:251599360;visibility:visible;mso-wrap-style:square;mso-width-percent:0;mso-height-percent:0;mso-wrap-distance-left:9pt;mso-wrap-distance-top:0;mso-wrap-distance-right:9pt;mso-wrap-distance-bottom:0;mso-position-horizontal:absolute;mso-position-horizontal-relative:text;mso-position-vertical:absolute;mso-position-vertical-relative:text;mso-width-percent:0;mso-height-percent:0;mso-width-relative:page;mso-height-relative:page;v-text-anchor:top" o:spid="_x0000_s1026" o:allowincell="f" filled="f" strokeweight="1pt" o:gfxdata="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" w14:anchorId="6C44B7D3"/>
           </w:pict>

</xml_diff>